<commit_message>
docs: amend SAD requirements and stock data definitions
</commit_message>
<xml_diff>
--- a/docs/Team_2_Able_Bibb_Tankeu_SAD_Amended.docx
+++ b/docs/Team_2_Able_Bibb_Tankeu_SAD_Amended.docx
@@ -461,7 +461,7 @@
             </w:rPr>
             <w:fldChar w:fldCharType="separate"/>
           </w:r>
-          <w:hyperlink w:anchor="_Toc240133554" w:history="1">
+          <w:hyperlink w:anchor="_Toc242716672" w:history="1">
             <w:r>
               <w:rPr>
                 <w:rStyle w:val="Hyperlink"/>
@@ -488,7 +488,7 @@
                 <w:noProof/>
                 <w:webHidden/>
               </w:rPr>
-              <w:instrText xml:space="preserve"> PAGEREF _Toc240133554 \h </w:instrText>
+              <w:instrText xml:space="preserve"> PAGEREF _Toc242716672 \h </w:instrText>
             </w:r>
             <w:r>
               <w:rPr>
@@ -508,7 +508,7 @@
                 <w:noProof/>
                 <w:webHidden/>
               </w:rPr>
-              <w:t>1</w:t>
+              <w:t>4</w:t>
             </w:r>
             <w:r>
               <w:rPr>
@@ -534,7 +534,7 @@
               <w14:ligatures w14:val="standardContextual"/>
             </w:rPr>
           </w:pPr>
-          <w:hyperlink w:anchor="_Toc240133555" w:history="1">
+          <w:hyperlink w:anchor="_Toc242716673" w:history="1">
             <w:r>
               <w:rPr>
                 <w:rStyle w:val="Hyperlink"/>
@@ -561,7 +561,7 @@
                 <w:noProof/>
                 <w:webHidden/>
               </w:rPr>
-              <w:instrText xml:space="preserve"> PAGEREF _Toc240133555 \h </w:instrText>
+              <w:instrText xml:space="preserve"> PAGEREF _Toc242716673 \h </w:instrText>
             </w:r>
             <w:r>
               <w:rPr>
@@ -581,7 +581,7 @@
                 <w:noProof/>
                 <w:webHidden/>
               </w:rPr>
-              <w:t>1</w:t>
+              <w:t>4</w:t>
             </w:r>
             <w:r>
               <w:rPr>
@@ -607,7 +607,7 @@
               <w14:ligatures w14:val="standardContextual"/>
             </w:rPr>
           </w:pPr>
-          <w:hyperlink w:anchor="_Toc240133556" w:history="1">
+          <w:hyperlink w:anchor="_Toc242716674" w:history="1">
             <w:r>
               <w:rPr>
                 <w:rStyle w:val="Hyperlink"/>
@@ -634,7 +634,7 @@
                 <w:noProof/>
                 <w:webHidden/>
               </w:rPr>
-              <w:instrText xml:space="preserve"> PAGEREF _Toc240133556 \h </w:instrText>
+              <w:instrText xml:space="preserve"> PAGEREF _Toc242716674 \h </w:instrText>
             </w:r>
             <w:r>
               <w:rPr>
@@ -654,7 +654,7 @@
                 <w:noProof/>
                 <w:webHidden/>
               </w:rPr>
-              <w:t>1</w:t>
+              <w:t>4</w:t>
             </w:r>
             <w:r>
               <w:rPr>
@@ -680,7 +680,7 @@
               <w14:ligatures w14:val="standardContextual"/>
             </w:rPr>
           </w:pPr>
-          <w:hyperlink w:anchor="_Toc240133557" w:history="1">
+          <w:hyperlink w:anchor="_Toc242716675" w:history="1">
             <w:r>
               <w:rPr>
                 <w:rStyle w:val="Hyperlink"/>
@@ -707,7 +707,7 @@
                 <w:noProof/>
                 <w:webHidden/>
               </w:rPr>
-              <w:instrText xml:space="preserve"> PAGEREF _Toc240133557 \h </w:instrText>
+              <w:instrText xml:space="preserve"> PAGEREF _Toc242716675 \h </w:instrText>
             </w:r>
             <w:r>
               <w:rPr>
@@ -727,7 +727,7 @@
                 <w:noProof/>
                 <w:webHidden/>
               </w:rPr>
-              <w:t>1</w:t>
+              <w:t>6</w:t>
             </w:r>
             <w:r>
               <w:rPr>
@@ -753,7 +753,7 @@
               <w14:ligatures w14:val="standardContextual"/>
             </w:rPr>
           </w:pPr>
-          <w:hyperlink w:anchor="_Toc240133558" w:history="1">
+          <w:hyperlink w:anchor="_Toc242716676" w:history="1">
             <w:r>
               <w:rPr>
                 <w:rStyle w:val="Hyperlink"/>
@@ -780,7 +780,7 @@
                 <w:noProof/>
                 <w:webHidden/>
               </w:rPr>
-              <w:instrText xml:space="preserve"> PAGEREF _Toc240133558 \h </w:instrText>
+              <w:instrText xml:space="preserve"> PAGEREF _Toc242716676 \h </w:instrText>
             </w:r>
             <w:r>
               <w:rPr>
@@ -800,7 +800,7 @@
                 <w:noProof/>
                 <w:webHidden/>
               </w:rPr>
-              <w:t>1</w:t>
+              <w:t>15</w:t>
             </w:r>
             <w:r>
               <w:rPr>
@@ -826,7 +826,7 @@
               <w14:ligatures w14:val="standardContextual"/>
             </w:rPr>
           </w:pPr>
-          <w:hyperlink w:anchor="_Toc240133559" w:history="1">
+          <w:hyperlink w:anchor="_Toc242716677" w:history="1">
             <w:r>
               <w:rPr>
                 <w:rStyle w:val="Hyperlink"/>
@@ -853,7 +853,7 @@
                 <w:noProof/>
                 <w:webHidden/>
               </w:rPr>
-              <w:instrText xml:space="preserve"> PAGEREF _Toc240133559 \h </w:instrText>
+              <w:instrText xml:space="preserve"> PAGEREF _Toc242716677 \h </w:instrText>
             </w:r>
             <w:r>
               <w:rPr>
@@ -873,7 +873,7 @@
                 <w:noProof/>
                 <w:webHidden/>
               </w:rPr>
-              <w:t>1</w:t>
+              <w:t>15</w:t>
             </w:r>
             <w:r>
               <w:rPr>
@@ -899,7 +899,7 @@
               <w14:ligatures w14:val="standardContextual"/>
             </w:rPr>
           </w:pPr>
-          <w:hyperlink w:anchor="_Toc240133560" w:history="1">
+          <w:hyperlink w:anchor="_Toc242716678" w:history="1">
             <w:r>
               <w:rPr>
                 <w:rStyle w:val="Hyperlink"/>
@@ -926,7 +926,7 @@
                 <w:noProof/>
                 <w:webHidden/>
               </w:rPr>
-              <w:instrText xml:space="preserve"> PAGEREF _Toc240133560 \h </w:instrText>
+              <w:instrText xml:space="preserve"> PAGEREF _Toc242716678 \h </w:instrText>
             </w:r>
             <w:r>
               <w:rPr>
@@ -946,7 +946,7 @@
                 <w:noProof/>
                 <w:webHidden/>
               </w:rPr>
-              <w:t>1</w:t>
+              <w:t>15</w:t>
             </w:r>
             <w:r>
               <w:rPr>
@@ -972,7 +972,7 @@
               <w14:ligatures w14:val="standardContextual"/>
             </w:rPr>
           </w:pPr>
-          <w:hyperlink w:anchor="_Toc240133561" w:history="1">
+          <w:hyperlink w:anchor="_Toc242716679" w:history="1">
             <w:r>
               <w:rPr>
                 <w:rStyle w:val="Hyperlink"/>
@@ -999,7 +999,7 @@
                 <w:noProof/>
                 <w:webHidden/>
               </w:rPr>
-              <w:instrText xml:space="preserve"> PAGEREF _Toc240133561 \h </w:instrText>
+              <w:instrText xml:space="preserve"> PAGEREF _Toc242716679 \h </w:instrText>
             </w:r>
             <w:r>
               <w:rPr>
@@ -1019,7 +1019,7 @@
                 <w:noProof/>
                 <w:webHidden/>
               </w:rPr>
-              <w:t>1</w:t>
+              <w:t>15</w:t>
             </w:r>
             <w:r>
               <w:rPr>
@@ -1045,7 +1045,7 @@
               <w14:ligatures w14:val="standardContextual"/>
             </w:rPr>
           </w:pPr>
-          <w:hyperlink w:anchor="_Toc240133562" w:history="1">
+          <w:hyperlink w:anchor="_Toc242716680" w:history="1">
             <w:r>
               <w:rPr>
                 <w:rStyle w:val="Hyperlink"/>
@@ -1072,7 +1072,7 @@
                 <w:noProof/>
                 <w:webHidden/>
               </w:rPr>
-              <w:instrText xml:space="preserve"> PAGEREF _Toc240133562 \h </w:instrText>
+              <w:instrText xml:space="preserve"> PAGEREF _Toc242716680 \h </w:instrText>
             </w:r>
             <w:r>
               <w:rPr>
@@ -1092,7 +1092,7 @@
                 <w:noProof/>
                 <w:webHidden/>
               </w:rPr>
-              <w:t>1</w:t>
+              <w:t>16</w:t>
             </w:r>
             <w:r>
               <w:rPr>
@@ -1118,7 +1118,7 @@
               <w14:ligatures w14:val="standardContextual"/>
             </w:rPr>
           </w:pPr>
-          <w:hyperlink w:anchor="_Toc240133563" w:history="1">
+          <w:hyperlink w:anchor="_Toc242716681" w:history="1">
             <w:r>
               <w:rPr>
                 <w:rStyle w:val="Hyperlink"/>
@@ -1145,7 +1145,7 @@
                 <w:noProof/>
                 <w:webHidden/>
               </w:rPr>
-              <w:instrText xml:space="preserve"> PAGEREF _Toc240133563 \h </w:instrText>
+              <w:instrText xml:space="preserve"> PAGEREF _Toc242716681 \h </w:instrText>
             </w:r>
             <w:r>
               <w:rPr>
@@ -1165,7 +1165,7 @@
                 <w:noProof/>
                 <w:webHidden/>
               </w:rPr>
-              <w:t>1</w:t>
+              <w:t>16</w:t>
             </w:r>
             <w:r>
               <w:rPr>
@@ -1191,7 +1191,7 @@
               <w14:ligatures w14:val="standardContextual"/>
             </w:rPr>
           </w:pPr>
-          <w:hyperlink w:anchor="_Toc240133564" w:history="1">
+          <w:hyperlink w:anchor="_Toc242716682" w:history="1">
             <w:r>
               <w:rPr>
                 <w:rStyle w:val="Hyperlink"/>
@@ -1218,7 +1218,7 @@
                 <w:noProof/>
                 <w:webHidden/>
               </w:rPr>
-              <w:instrText xml:space="preserve"> PAGEREF _Toc240133564 \h </w:instrText>
+              <w:instrText xml:space="preserve"> PAGEREF _Toc242716682 \h </w:instrText>
             </w:r>
             <w:r>
               <w:rPr>
@@ -1238,7 +1238,7 @@
                 <w:noProof/>
                 <w:webHidden/>
               </w:rPr>
-              <w:t>1</w:t>
+              <w:t>17</w:t>
             </w:r>
             <w:r>
               <w:rPr>
@@ -1264,7 +1264,7 @@
               <w14:ligatures w14:val="standardContextual"/>
             </w:rPr>
           </w:pPr>
-          <w:hyperlink w:anchor="_Toc240133565" w:history="1">
+          <w:hyperlink w:anchor="_Toc242716683" w:history="1">
             <w:r>
               <w:rPr>
                 <w:rStyle w:val="Hyperlink"/>
@@ -1291,7 +1291,7 @@
                 <w:noProof/>
                 <w:webHidden/>
               </w:rPr>
-              <w:instrText xml:space="preserve"> PAGEREF _Toc240133565 \h </w:instrText>
+              <w:instrText xml:space="preserve"> PAGEREF _Toc242716683 \h </w:instrText>
             </w:r>
             <w:r>
               <w:rPr>
@@ -1311,7 +1311,7 @@
                 <w:noProof/>
                 <w:webHidden/>
               </w:rPr>
-              <w:t>1</w:t>
+              <w:t>17</w:t>
             </w:r>
             <w:r>
               <w:rPr>
@@ -1337,7 +1337,7 @@
               <w14:ligatures w14:val="standardContextual"/>
             </w:rPr>
           </w:pPr>
-          <w:hyperlink w:anchor="_Toc240133566" w:history="1">
+          <w:hyperlink w:anchor="_Toc242716684" w:history="1">
             <w:r>
               <w:rPr>
                 <w:rStyle w:val="Hyperlink"/>
@@ -1364,7 +1364,7 @@
                 <w:noProof/>
                 <w:webHidden/>
               </w:rPr>
-              <w:instrText xml:space="preserve"> PAGEREF _Toc240133566 \h </w:instrText>
+              <w:instrText xml:space="preserve"> PAGEREF _Toc242716684 \h </w:instrText>
             </w:r>
             <w:r>
               <w:rPr>
@@ -1384,7 +1384,7 @@
                 <w:noProof/>
                 <w:webHidden/>
               </w:rPr>
-              <w:t>1</w:t>
+              <w:t>17</w:t>
             </w:r>
             <w:r>
               <w:rPr>
@@ -1410,7 +1410,7 @@
               <w14:ligatures w14:val="standardContextual"/>
             </w:rPr>
           </w:pPr>
-          <w:hyperlink w:anchor="_Toc240133567" w:history="1">
+          <w:hyperlink w:anchor="_Toc242716685" w:history="1">
             <w:r>
               <w:rPr>
                 <w:rStyle w:val="Hyperlink"/>
@@ -1437,7 +1437,7 @@
                 <w:noProof/>
                 <w:webHidden/>
               </w:rPr>
-              <w:instrText xml:space="preserve"> PAGEREF _Toc240133567 \h </w:instrText>
+              <w:instrText xml:space="preserve"> PAGEREF _Toc242716685 \h </w:instrText>
             </w:r>
             <w:r>
               <w:rPr>
@@ -1457,7 +1457,7 @@
                 <w:noProof/>
                 <w:webHidden/>
               </w:rPr>
-              <w:t>1</w:t>
+              <w:t>18</w:t>
             </w:r>
             <w:r>
               <w:rPr>
@@ -1483,7 +1483,7 @@
               <w14:ligatures w14:val="standardContextual"/>
             </w:rPr>
           </w:pPr>
-          <w:hyperlink w:anchor="_Toc240133568" w:history="1">
+          <w:hyperlink w:anchor="_Toc242716686" w:history="1">
             <w:r>
               <w:rPr>
                 <w:rStyle w:val="Hyperlink"/>
@@ -1510,7 +1510,7 @@
                 <w:noProof/>
                 <w:webHidden/>
               </w:rPr>
-              <w:instrText xml:space="preserve"> PAGEREF _Toc240133568 \h </w:instrText>
+              <w:instrText xml:space="preserve"> PAGEREF _Toc242716686 \h </w:instrText>
             </w:r>
             <w:r>
               <w:rPr>
@@ -1530,7 +1530,7 @@
                 <w:noProof/>
                 <w:webHidden/>
               </w:rPr>
-              <w:t>1</w:t>
+              <w:t>18</w:t>
             </w:r>
             <w:r>
               <w:rPr>
@@ -1556,7 +1556,7 @@
               <w14:ligatures w14:val="standardContextual"/>
             </w:rPr>
           </w:pPr>
-          <w:hyperlink w:anchor="_Toc240133569" w:history="1">
+          <w:hyperlink w:anchor="_Toc242716687" w:history="1">
             <w:r>
               <w:rPr>
                 <w:rStyle w:val="Hyperlink"/>
@@ -1583,7 +1583,7 @@
                 <w:noProof/>
                 <w:webHidden/>
               </w:rPr>
-              <w:instrText xml:space="preserve"> PAGEREF _Toc240133569 \h </w:instrText>
+              <w:instrText xml:space="preserve"> PAGEREF _Toc242716687 \h </w:instrText>
             </w:r>
             <w:r>
               <w:rPr>
@@ -1603,7 +1603,80 @@
                 <w:noProof/>
                 <w:webHidden/>
               </w:rPr>
-              <w:t>1</w:t>
+              <w:t>20</w:t>
+            </w:r>
+            <w:r>
+              <w:rPr>
+                <w:noProof/>
+                <w:webHidden/>
+              </w:rPr>
+              <w:fldChar w:fldCharType="end"/>
+            </w:r>
+          </w:hyperlink>
+        </w:p>
+        <w:p>
+          <w:pPr>
+            <w:pStyle w:val="TOC2"/>
+            <w:tabs>
+              <w:tab w:val="right" w:leader="dot" w:pos="9350"/>
+            </w:tabs>
+            <w:rPr>
+              <w:rFonts w:cstheme="minorBidi"/>
+              <w:noProof/>
+              <w:color w:val="auto"/>
+              <w:kern w:val="2"/>
+              <w:szCs w:val="24"/>
+              <w14:ligatures w14:val="standardContextual"/>
+            </w:rPr>
+          </w:pPr>
+          <w:hyperlink w:anchor="_Toc242716688" w:history="1">
+            <w:r>
+              <w:rPr>
+                <w:rStyle w:val="Hyperlink"/>
+                <w:noProof/>
+              </w:rPr>
+              <w:t>Stock Data Definitions</w:t>
+            </w:r>
+            <w:r>
+              <w:rPr>
+                <w:noProof/>
+                <w:webHidden/>
+              </w:rPr>
+              <w:tab/>
+            </w:r>
+            <w:r>
+              <w:rPr>
+                <w:noProof/>
+                <w:webHidden/>
+              </w:rPr>
+              <w:fldChar w:fldCharType="begin"/>
+            </w:r>
+            <w:r>
+              <w:rPr>
+                <w:noProof/>
+                <w:webHidden/>
+              </w:rPr>
+              <w:instrText xml:space="preserve"> PAGEREF _Toc242716688 \h </w:instrText>
+            </w:r>
+            <w:r>
+              <w:rPr>
+                <w:noProof/>
+                <w:webHidden/>
+              </w:rPr>
+            </w:r>
+            <w:r>
+              <w:rPr>
+                <w:noProof/>
+                <w:webHidden/>
+              </w:rPr>
+              <w:fldChar w:fldCharType="separate"/>
+            </w:r>
+            <w:r>
+              <w:rPr>
+                <w:noProof/>
+                <w:webHidden/>
+              </w:rPr>
+              <w:t>21</w:t>
             </w:r>
             <w:r>
               <w:rPr>
@@ -1629,7 +1702,7 @@
               <w14:ligatures w14:val="standardContextual"/>
             </w:rPr>
           </w:pPr>
-          <w:hyperlink w:anchor="_Toc240133570" w:history="1">
+          <w:hyperlink w:anchor="_Toc242716689" w:history="1">
             <w:r>
               <w:rPr>
                 <w:rStyle w:val="Hyperlink"/>
@@ -1656,7 +1729,7 @@
                 <w:noProof/>
                 <w:webHidden/>
               </w:rPr>
-              <w:instrText xml:space="preserve"> PAGEREF _Toc240133570 \h </w:instrText>
+              <w:instrText xml:space="preserve"> PAGEREF _Toc242716689 \h </w:instrText>
             </w:r>
             <w:r>
               <w:rPr>
@@ -1676,7 +1749,7 @@
                 <w:noProof/>
                 <w:webHidden/>
               </w:rPr>
-              <w:t>1</w:t>
+              <w:t>22</w:t>
             </w:r>
             <w:r>
               <w:rPr>
@@ -1702,7 +1775,7 @@
               <w14:ligatures w14:val="standardContextual"/>
             </w:rPr>
           </w:pPr>
-          <w:hyperlink w:anchor="_Toc240133571" w:history="1">
+          <w:hyperlink w:anchor="_Toc242716690" w:history="1">
             <w:r>
               <w:rPr>
                 <w:rStyle w:val="Hyperlink"/>
@@ -1729,7 +1802,7 @@
                 <w:noProof/>
                 <w:webHidden/>
               </w:rPr>
-              <w:instrText xml:space="preserve"> PAGEREF _Toc240133571 \h </w:instrText>
+              <w:instrText xml:space="preserve"> PAGEREF _Toc242716690 \h </w:instrText>
             </w:r>
             <w:r>
               <w:rPr>
@@ -1749,7 +1822,7 @@
                 <w:noProof/>
                 <w:webHidden/>
               </w:rPr>
-              <w:t>1</w:t>
+              <w:t>23</w:t>
             </w:r>
             <w:r>
               <w:rPr>
@@ -1775,7 +1848,7 @@
               <w14:ligatures w14:val="standardContextual"/>
             </w:rPr>
           </w:pPr>
-          <w:hyperlink w:anchor="_Toc240133572" w:history="1">
+          <w:hyperlink w:anchor="_Toc242716691" w:history="1">
             <w:r>
               <w:rPr>
                 <w:rStyle w:val="Hyperlink"/>
@@ -1802,7 +1875,7 @@
                 <w:noProof/>
                 <w:webHidden/>
               </w:rPr>
-              <w:instrText xml:space="preserve"> PAGEREF _Toc240133572 \h </w:instrText>
+              <w:instrText xml:space="preserve"> PAGEREF _Toc242716691 \h </w:instrText>
             </w:r>
             <w:r>
               <w:rPr>
@@ -1822,7 +1895,7 @@
                 <w:noProof/>
                 <w:webHidden/>
               </w:rPr>
-              <w:t>1</w:t>
+              <w:t>24</w:t>
             </w:r>
             <w:r>
               <w:rPr>
@@ -1848,7 +1921,7 @@
               <w14:ligatures w14:val="standardContextual"/>
             </w:rPr>
           </w:pPr>
-          <w:hyperlink w:anchor="_Toc240133573" w:history="1">
+          <w:hyperlink w:anchor="_Toc242716692" w:history="1">
             <w:r>
               <w:rPr>
                 <w:rStyle w:val="Hyperlink"/>
@@ -1875,7 +1948,7 @@
                 <w:noProof/>
                 <w:webHidden/>
               </w:rPr>
-              <w:instrText xml:space="preserve"> PAGEREF _Toc240133573 \h </w:instrText>
+              <w:instrText xml:space="preserve"> PAGEREF _Toc242716692 \h </w:instrText>
             </w:r>
             <w:r>
               <w:rPr>
@@ -1895,7 +1968,7 @@
                 <w:noProof/>
                 <w:webHidden/>
               </w:rPr>
-              <w:t>1</w:t>
+              <w:t>25</w:t>
             </w:r>
             <w:r>
               <w:rPr>
@@ -1921,7 +1994,7 @@
               <w14:ligatures w14:val="standardContextual"/>
             </w:rPr>
           </w:pPr>
-          <w:hyperlink w:anchor="_Toc240133574" w:history="1">
+          <w:hyperlink w:anchor="_Toc242716693" w:history="1">
             <w:r>
               <w:rPr>
                 <w:rStyle w:val="Hyperlink"/>
@@ -1948,7 +2021,7 @@
                 <w:noProof/>
                 <w:webHidden/>
               </w:rPr>
-              <w:instrText xml:space="preserve"> PAGEREF _Toc240133574 \h </w:instrText>
+              <w:instrText xml:space="preserve"> PAGEREF _Toc242716693 \h </w:instrText>
             </w:r>
             <w:r>
               <w:rPr>
@@ -1968,7 +2041,7 @@
                 <w:noProof/>
                 <w:webHidden/>
               </w:rPr>
-              <w:t>1</w:t>
+              <w:t>26</w:t>
             </w:r>
             <w:r>
               <w:rPr>
@@ -1994,7 +2067,7 @@
               <w14:ligatures w14:val="standardContextual"/>
             </w:rPr>
           </w:pPr>
-          <w:hyperlink w:anchor="_Toc240133575" w:history="1">
+          <w:hyperlink w:anchor="_Toc242716694" w:history="1">
             <w:r>
               <w:rPr>
                 <w:rStyle w:val="Hyperlink"/>
@@ -2021,7 +2094,7 @@
                 <w:noProof/>
                 <w:webHidden/>
               </w:rPr>
-              <w:instrText xml:space="preserve"> PAGEREF _Toc240133575 \h </w:instrText>
+              <w:instrText xml:space="preserve"> PAGEREF _Toc242716694 \h </w:instrText>
             </w:r>
             <w:r>
               <w:rPr>
@@ -2041,7 +2114,7 @@
                 <w:noProof/>
                 <w:webHidden/>
               </w:rPr>
-              <w:t>1</w:t>
+              <w:t>27</w:t>
             </w:r>
             <w:r>
               <w:rPr>
@@ -2067,7 +2140,7 @@
               <w14:ligatures w14:val="standardContextual"/>
             </w:rPr>
           </w:pPr>
-          <w:hyperlink w:anchor="_Toc240133576" w:history="1">
+          <w:hyperlink w:anchor="_Toc242716695" w:history="1">
             <w:r>
               <w:rPr>
                 <w:rStyle w:val="Hyperlink"/>
@@ -2094,7 +2167,7 @@
                 <w:noProof/>
                 <w:webHidden/>
               </w:rPr>
-              <w:instrText xml:space="preserve"> PAGEREF _Toc240133576 \h </w:instrText>
+              <w:instrText xml:space="preserve"> PAGEREF _Toc242716695 \h </w:instrText>
             </w:r>
             <w:r>
               <w:rPr>
@@ -2114,7 +2187,7 @@
                 <w:noProof/>
                 <w:webHidden/>
               </w:rPr>
-              <w:t>1</w:t>
+              <w:t>27</w:t>
             </w:r>
             <w:r>
               <w:rPr>
@@ -2140,7 +2213,7 @@
               <w14:ligatures w14:val="standardContextual"/>
             </w:rPr>
           </w:pPr>
-          <w:hyperlink w:anchor="_Toc240133577" w:history="1">
+          <w:hyperlink w:anchor="_Toc242716696" w:history="1">
             <w:r>
               <w:rPr>
                 <w:rStyle w:val="Hyperlink"/>
@@ -2167,7 +2240,7 @@
                 <w:noProof/>
                 <w:webHidden/>
               </w:rPr>
-              <w:instrText xml:space="preserve"> PAGEREF _Toc240133577 \h </w:instrText>
+              <w:instrText xml:space="preserve"> PAGEREF _Toc242716696 \h </w:instrText>
             </w:r>
             <w:r>
               <w:rPr>
@@ -2187,7 +2260,7 @@
                 <w:noProof/>
                 <w:webHidden/>
               </w:rPr>
-              <w:t>1</w:t>
+              <w:t>28</w:t>
             </w:r>
             <w:r>
               <w:rPr>
@@ -2213,7 +2286,7 @@
               <w14:ligatures w14:val="standardContextual"/>
             </w:rPr>
           </w:pPr>
-          <w:hyperlink w:anchor="_Toc240133578" w:history="1">
+          <w:hyperlink w:anchor="_Toc242716697" w:history="1">
             <w:r>
               <w:rPr>
                 <w:rStyle w:val="Hyperlink"/>
@@ -2240,7 +2313,7 @@
                 <w:noProof/>
                 <w:webHidden/>
               </w:rPr>
-              <w:instrText xml:space="preserve"> PAGEREF _Toc240133578 \h </w:instrText>
+              <w:instrText xml:space="preserve"> PAGEREF _Toc242716697 \h </w:instrText>
             </w:r>
             <w:r>
               <w:rPr>
@@ -2260,7 +2333,7 @@
                 <w:noProof/>
                 <w:webHidden/>
               </w:rPr>
-              <w:t>1</w:t>
+              <w:t>29</w:t>
             </w:r>
             <w:r>
               <w:rPr>
@@ -2286,7 +2359,7 @@
               <w14:ligatures w14:val="standardContextual"/>
             </w:rPr>
           </w:pPr>
-          <w:hyperlink w:anchor="_Toc240133579" w:history="1">
+          <w:hyperlink w:anchor="_Toc242716698" w:history="1">
             <w:r>
               <w:rPr>
                 <w:rStyle w:val="Hyperlink"/>
@@ -2313,7 +2386,7 @@
                 <w:noProof/>
                 <w:webHidden/>
               </w:rPr>
-              <w:instrText xml:space="preserve"> PAGEREF _Toc240133579 \h </w:instrText>
+              <w:instrText xml:space="preserve"> PAGEREF _Toc242716698 \h </w:instrText>
             </w:r>
             <w:r>
               <w:rPr>
@@ -2333,7 +2406,7 @@
                 <w:noProof/>
                 <w:webHidden/>
               </w:rPr>
-              <w:t>1</w:t>
+              <w:t>29</w:t>
             </w:r>
             <w:r>
               <w:rPr>
@@ -2359,7 +2432,7 @@
               <w14:ligatures w14:val="standardContextual"/>
             </w:rPr>
           </w:pPr>
-          <w:hyperlink w:anchor="_Toc240133580" w:history="1">
+          <w:hyperlink w:anchor="_Toc242716699" w:history="1">
             <w:r>
               <w:rPr>
                 <w:rStyle w:val="Hyperlink"/>
@@ -2386,7 +2459,7 @@
                 <w:noProof/>
                 <w:webHidden/>
               </w:rPr>
-              <w:instrText xml:space="preserve"> PAGEREF _Toc240133580 \h </w:instrText>
+              <w:instrText xml:space="preserve"> PAGEREF _Toc242716699 \h </w:instrText>
             </w:r>
             <w:r>
               <w:rPr>
@@ -2406,7 +2479,7 @@
                 <w:noProof/>
                 <w:webHidden/>
               </w:rPr>
-              <w:t>1</w:t>
+              <w:t>31</w:t>
             </w:r>
             <w:r>
               <w:rPr>
@@ -2432,7 +2505,7 @@
               <w14:ligatures w14:val="standardContextual"/>
             </w:rPr>
           </w:pPr>
-          <w:hyperlink w:anchor="_Toc240133581" w:history="1">
+          <w:hyperlink w:anchor="_Toc242716700" w:history="1">
             <w:r>
               <w:rPr>
                 <w:rStyle w:val="Hyperlink"/>
@@ -2459,7 +2532,7 @@
                 <w:noProof/>
                 <w:webHidden/>
               </w:rPr>
-              <w:instrText xml:space="preserve"> PAGEREF _Toc240133581 \h </w:instrText>
+              <w:instrText xml:space="preserve"> PAGEREF _Toc242716700 \h </w:instrText>
             </w:r>
             <w:r>
               <w:rPr>
@@ -2479,7 +2552,7 @@
                 <w:noProof/>
                 <w:webHidden/>
               </w:rPr>
-              <w:t>1</w:t>
+              <w:t>31</w:t>
             </w:r>
             <w:r>
               <w:rPr>
@@ -2505,7 +2578,7 @@
               <w14:ligatures w14:val="standardContextual"/>
             </w:rPr>
           </w:pPr>
-          <w:hyperlink w:anchor="_Toc240133582" w:history="1">
+          <w:hyperlink w:anchor="_Toc242716701" w:history="1">
             <w:r>
               <w:rPr>
                 <w:rStyle w:val="Hyperlink"/>
@@ -2532,7 +2605,7 @@
                 <w:noProof/>
                 <w:webHidden/>
               </w:rPr>
-              <w:instrText xml:space="preserve"> PAGEREF _Toc240133582 \h </w:instrText>
+              <w:instrText xml:space="preserve"> PAGEREF _Toc242716701 \h </w:instrText>
             </w:r>
             <w:r>
               <w:rPr>
@@ -2552,7 +2625,7 @@
                 <w:noProof/>
                 <w:webHidden/>
               </w:rPr>
-              <w:t>1</w:t>
+              <w:t>32</w:t>
             </w:r>
             <w:r>
               <w:rPr>
@@ -2578,7 +2651,7 @@
               <w14:ligatures w14:val="standardContextual"/>
             </w:rPr>
           </w:pPr>
-          <w:hyperlink w:anchor="_Toc240133583" w:history="1">
+          <w:hyperlink w:anchor="_Toc242716702" w:history="1">
             <w:r>
               <w:rPr>
                 <w:rStyle w:val="Hyperlink"/>
@@ -2605,7 +2678,7 @@
                 <w:noProof/>
                 <w:webHidden/>
               </w:rPr>
-              <w:instrText xml:space="preserve"> PAGEREF _Toc240133583 \h </w:instrText>
+              <w:instrText xml:space="preserve"> PAGEREF _Toc242716702 \h </w:instrText>
             </w:r>
             <w:r>
               <w:rPr>
@@ -2625,7 +2698,7 @@
                 <w:noProof/>
                 <w:webHidden/>
               </w:rPr>
-              <w:t>1</w:t>
+              <w:t>33</w:t>
             </w:r>
             <w:r>
               <w:rPr>
@@ -2651,7 +2724,7 @@
               <w14:ligatures w14:val="standardContextual"/>
             </w:rPr>
           </w:pPr>
-          <w:hyperlink w:anchor="_Toc240133584" w:history="1">
+          <w:hyperlink w:anchor="_Toc242716703" w:history="1">
             <w:r>
               <w:rPr>
                 <w:rStyle w:val="Hyperlink"/>
@@ -2679,7 +2752,7 @@
                 <w:noProof/>
                 <w:webHidden/>
               </w:rPr>
-              <w:instrText xml:space="preserve"> PAGEREF _Toc240133584 \h </w:instrText>
+              <w:instrText xml:space="preserve"> PAGEREF _Toc242716703 \h </w:instrText>
             </w:r>
             <w:r>
               <w:rPr>
@@ -2699,7 +2772,7 @@
                 <w:noProof/>
                 <w:webHidden/>
               </w:rPr>
-              <w:t>1</w:t>
+              <w:t>34</w:t>
             </w:r>
             <w:r>
               <w:rPr>
@@ -2725,7 +2798,7 @@
               <w14:ligatures w14:val="standardContextual"/>
             </w:rPr>
           </w:pPr>
-          <w:hyperlink w:anchor="_Toc240133585" w:history="1">
+          <w:hyperlink w:anchor="_Toc242716704" w:history="1">
             <w:r>
               <w:rPr>
                 <w:rStyle w:val="Hyperlink"/>
@@ -2752,7 +2825,7 @@
                 <w:noProof/>
                 <w:webHidden/>
               </w:rPr>
-              <w:instrText xml:space="preserve"> PAGEREF _Toc240133585 \h </w:instrText>
+              <w:instrText xml:space="preserve"> PAGEREF _Toc242716704 \h </w:instrText>
             </w:r>
             <w:r>
               <w:rPr>
@@ -2772,7 +2845,7 @@
                 <w:noProof/>
                 <w:webHidden/>
               </w:rPr>
-              <w:t>1</w:t>
+              <w:t>34</w:t>
             </w:r>
             <w:r>
               <w:rPr>
@@ -2798,7 +2871,7 @@
               <w14:ligatures w14:val="standardContextual"/>
             </w:rPr>
           </w:pPr>
-          <w:hyperlink w:anchor="_Toc240133586" w:history="1">
+          <w:hyperlink w:anchor="_Toc242716705" w:history="1">
             <w:r>
               <w:rPr>
                 <w:rStyle w:val="Hyperlink"/>
@@ -2825,7 +2898,7 @@
                 <w:noProof/>
                 <w:webHidden/>
               </w:rPr>
-              <w:instrText xml:space="preserve"> PAGEREF _Toc240133586 \h </w:instrText>
+              <w:instrText xml:space="preserve"> PAGEREF _Toc242716705 \h </w:instrText>
             </w:r>
             <w:r>
               <w:rPr>
@@ -2845,7 +2918,7 @@
                 <w:noProof/>
                 <w:webHidden/>
               </w:rPr>
-              <w:t>1</w:t>
+              <w:t>34</w:t>
             </w:r>
             <w:r>
               <w:rPr>
@@ -2871,7 +2944,7 @@
               <w14:ligatures w14:val="standardContextual"/>
             </w:rPr>
           </w:pPr>
-          <w:hyperlink w:anchor="_Toc240133587" w:history="1">
+          <w:hyperlink w:anchor="_Toc242716706" w:history="1">
             <w:r>
               <w:rPr>
                 <w:rStyle w:val="Hyperlink"/>
@@ -2898,7 +2971,7 @@
                 <w:noProof/>
                 <w:webHidden/>
               </w:rPr>
-              <w:instrText xml:space="preserve"> PAGEREF _Toc240133587 \h </w:instrText>
+              <w:instrText xml:space="preserve"> PAGEREF _Toc242716706 \h </w:instrText>
             </w:r>
             <w:r>
               <w:rPr>
@@ -2918,7 +2991,7 @@
                 <w:noProof/>
                 <w:webHidden/>
               </w:rPr>
-              <w:t>1</w:t>
+              <w:t>35</w:t>
             </w:r>
             <w:r>
               <w:rPr>
@@ -2944,7 +3017,7 @@
               <w14:ligatures w14:val="standardContextual"/>
             </w:rPr>
           </w:pPr>
-          <w:hyperlink w:anchor="_Toc240133588" w:history="1">
+          <w:hyperlink w:anchor="_Toc242716707" w:history="1">
             <w:r>
               <w:rPr>
                 <w:rStyle w:val="Hyperlink"/>
@@ -2971,7 +3044,7 @@
                 <w:noProof/>
                 <w:webHidden/>
               </w:rPr>
-              <w:instrText xml:space="preserve"> PAGEREF _Toc240133588 \h </w:instrText>
+              <w:instrText xml:space="preserve"> PAGEREF _Toc242716707 \h </w:instrText>
             </w:r>
             <w:r>
               <w:rPr>
@@ -2991,7 +3064,299 @@
                 <w:noProof/>
                 <w:webHidden/>
               </w:rPr>
-              <w:t>1</w:t>
+              <w:t>36</w:t>
+            </w:r>
+            <w:r>
+              <w:rPr>
+                <w:noProof/>
+                <w:webHidden/>
+              </w:rPr>
+              <w:fldChar w:fldCharType="end"/>
+            </w:r>
+          </w:hyperlink>
+        </w:p>
+        <w:p>
+          <w:pPr>
+            <w:pStyle w:val="TOC1"/>
+            <w:tabs>
+              <w:tab w:val="right" w:leader="dot" w:pos="9350"/>
+            </w:tabs>
+            <w:rPr>
+              <w:rFonts w:cstheme="minorBidi"/>
+              <w:noProof/>
+              <w:color w:val="auto"/>
+              <w:kern w:val="2"/>
+              <w:szCs w:val="24"/>
+              <w14:ligatures w14:val="standardContextual"/>
+            </w:rPr>
+          </w:pPr>
+          <w:hyperlink w:anchor="_Toc242716708" w:history="1">
+            <w:r>
+              <w:rPr>
+                <w:rStyle w:val="Hyperlink"/>
+                <w:noProof/>
+              </w:rPr>
+              <w:t>Addendum</w:t>
+            </w:r>
+            <w:r>
+              <w:rPr>
+                <w:noProof/>
+                <w:webHidden/>
+              </w:rPr>
+              <w:tab/>
+            </w:r>
+            <w:r>
+              <w:rPr>
+                <w:noProof/>
+                <w:webHidden/>
+              </w:rPr>
+              <w:fldChar w:fldCharType="begin"/>
+            </w:r>
+            <w:r>
+              <w:rPr>
+                <w:noProof/>
+                <w:webHidden/>
+              </w:rPr>
+              <w:instrText xml:space="preserve"> PAGEREF _Toc242716708 \h </w:instrText>
+            </w:r>
+            <w:r>
+              <w:rPr>
+                <w:noProof/>
+                <w:webHidden/>
+              </w:rPr>
+            </w:r>
+            <w:r>
+              <w:rPr>
+                <w:noProof/>
+                <w:webHidden/>
+              </w:rPr>
+              <w:fldChar w:fldCharType="separate"/>
+            </w:r>
+            <w:r>
+              <w:rPr>
+                <w:noProof/>
+                <w:webHidden/>
+              </w:rPr>
+              <w:t>37</w:t>
+            </w:r>
+            <w:r>
+              <w:rPr>
+                <w:noProof/>
+                <w:webHidden/>
+              </w:rPr>
+              <w:fldChar w:fldCharType="end"/>
+            </w:r>
+          </w:hyperlink>
+        </w:p>
+        <w:p>
+          <w:pPr>
+            <w:pStyle w:val="TOC2"/>
+            <w:tabs>
+              <w:tab w:val="right" w:leader="dot" w:pos="9350"/>
+            </w:tabs>
+            <w:rPr>
+              <w:rFonts w:cstheme="minorBidi"/>
+              <w:noProof/>
+              <w:color w:val="auto"/>
+              <w:kern w:val="2"/>
+              <w:szCs w:val="24"/>
+              <w14:ligatures w14:val="standardContextual"/>
+            </w:rPr>
+          </w:pPr>
+          <w:hyperlink w:anchor="_Toc242716709" w:history="1">
+            <w:r>
+              <w:rPr>
+                <w:rStyle w:val="Hyperlink"/>
+                <w:noProof/>
+              </w:rPr>
+              <w:t>Revision History</w:t>
+            </w:r>
+            <w:r>
+              <w:rPr>
+                <w:noProof/>
+                <w:webHidden/>
+              </w:rPr>
+              <w:tab/>
+            </w:r>
+            <w:r>
+              <w:rPr>
+                <w:noProof/>
+                <w:webHidden/>
+              </w:rPr>
+              <w:fldChar w:fldCharType="begin"/>
+            </w:r>
+            <w:r>
+              <w:rPr>
+                <w:noProof/>
+                <w:webHidden/>
+              </w:rPr>
+              <w:instrText xml:space="preserve"> PAGEREF _Toc242716709 \h </w:instrText>
+            </w:r>
+            <w:r>
+              <w:rPr>
+                <w:noProof/>
+                <w:webHidden/>
+              </w:rPr>
+            </w:r>
+            <w:r>
+              <w:rPr>
+                <w:noProof/>
+                <w:webHidden/>
+              </w:rPr>
+              <w:fldChar w:fldCharType="separate"/>
+            </w:r>
+            <w:r>
+              <w:rPr>
+                <w:noProof/>
+                <w:webHidden/>
+              </w:rPr>
+              <w:t>37</w:t>
+            </w:r>
+            <w:r>
+              <w:rPr>
+                <w:noProof/>
+                <w:webHidden/>
+              </w:rPr>
+              <w:fldChar w:fldCharType="end"/>
+            </w:r>
+          </w:hyperlink>
+        </w:p>
+        <w:p>
+          <w:pPr>
+            <w:pStyle w:val="TOC2"/>
+            <w:tabs>
+              <w:tab w:val="right" w:leader="dot" w:pos="9350"/>
+            </w:tabs>
+            <w:rPr>
+              <w:rFonts w:cstheme="minorBidi"/>
+              <w:noProof/>
+              <w:color w:val="auto"/>
+              <w:kern w:val="2"/>
+              <w:szCs w:val="24"/>
+              <w14:ligatures w14:val="standardContextual"/>
+            </w:rPr>
+          </w:pPr>
+          <w:hyperlink w:anchor="_Toc242716710" w:history="1">
+            <w:r>
+              <w:rPr>
+                <w:rStyle w:val="Hyperlink"/>
+                <w:noProof/>
+              </w:rPr>
+              <w:t>Addendum 1 Business Rule Clarifications</w:t>
+            </w:r>
+            <w:r>
+              <w:rPr>
+                <w:noProof/>
+                <w:webHidden/>
+              </w:rPr>
+              <w:tab/>
+            </w:r>
+            <w:r>
+              <w:rPr>
+                <w:noProof/>
+                <w:webHidden/>
+              </w:rPr>
+              <w:fldChar w:fldCharType="begin"/>
+            </w:r>
+            <w:r>
+              <w:rPr>
+                <w:noProof/>
+                <w:webHidden/>
+              </w:rPr>
+              <w:instrText xml:space="preserve"> PAGEREF _Toc242716710 \h </w:instrText>
+            </w:r>
+            <w:r>
+              <w:rPr>
+                <w:noProof/>
+                <w:webHidden/>
+              </w:rPr>
+            </w:r>
+            <w:r>
+              <w:rPr>
+                <w:noProof/>
+                <w:webHidden/>
+              </w:rPr>
+              <w:fldChar w:fldCharType="separate"/>
+            </w:r>
+            <w:r>
+              <w:rPr>
+                <w:noProof/>
+                <w:webHidden/>
+              </w:rPr>
+              <w:t>37</w:t>
+            </w:r>
+            <w:r>
+              <w:rPr>
+                <w:noProof/>
+                <w:webHidden/>
+              </w:rPr>
+              <w:fldChar w:fldCharType="end"/>
+            </w:r>
+          </w:hyperlink>
+        </w:p>
+        <w:p>
+          <w:pPr>
+            <w:pStyle w:val="TOC2"/>
+            <w:tabs>
+              <w:tab w:val="right" w:leader="dot" w:pos="9350"/>
+            </w:tabs>
+            <w:rPr>
+              <w:rFonts w:cstheme="minorBidi"/>
+              <w:noProof/>
+              <w:color w:val="auto"/>
+              <w:kern w:val="2"/>
+              <w:szCs w:val="24"/>
+              <w14:ligatures w14:val="standardContextual"/>
+            </w:rPr>
+          </w:pPr>
+          <w:hyperlink w:anchor="_Toc242716711" w:history="1">
+            <w:r>
+              <w:rPr>
+                <w:rStyle w:val="Hyperlink"/>
+                <w:noProof/>
+              </w:rPr>
+              <w:t>Implementation Notes</w:t>
+            </w:r>
+            <w:r>
+              <w:rPr>
+                <w:noProof/>
+                <w:webHidden/>
+              </w:rPr>
+              <w:tab/>
+            </w:r>
+            <w:r>
+              <w:rPr>
+                <w:noProof/>
+                <w:webHidden/>
+              </w:rPr>
+              <w:fldChar w:fldCharType="begin"/>
+            </w:r>
+            <w:r>
+              <w:rPr>
+                <w:noProof/>
+                <w:webHidden/>
+              </w:rPr>
+              <w:instrText xml:space="preserve"> PAGEREF _Toc242716711 \h </w:instrText>
+            </w:r>
+            <w:r>
+              <w:rPr>
+                <w:noProof/>
+                <w:webHidden/>
+              </w:rPr>
+            </w:r>
+            <w:r>
+              <w:rPr>
+                <w:noProof/>
+                <w:webHidden/>
+              </w:rPr>
+              <w:fldChar w:fldCharType="separate"/>
+            </w:r>
+            <w:r>
+              <w:rPr>
+                <w:noProof/>
+                <w:webHidden/>
+              </w:rPr>
+              <w:t>38</w:t>
             </w:r>
             <w:r>
               <w:rPr>
@@ -3044,7 +3409,7 @@
       <w:pPr>
         <w:pStyle w:val="Heading1"/>
       </w:pPr>
-      <w:bookmarkStart w:id="0" w:name="_Toc240133554"/>
+      <w:bookmarkStart w:id="0" w:name="_Toc242716672"/>
       <w:r>
         <w:lastRenderedPageBreak/>
         <w:t>Background</w:t>
@@ -3055,7 +3420,7 @@
       <w:pPr>
         <w:pStyle w:val="Heading2"/>
       </w:pPr>
-      <w:bookmarkStart w:id="1" w:name="_Toc240133555"/>
+      <w:bookmarkStart w:id="1" w:name="_Toc242716673"/>
       <w:r>
         <w:t xml:space="preserve">Problem </w:t>
       </w:r>
@@ -3091,113 +3456,65 @@
           <w:color w:val="000000"/>
           <w:szCs w:val="24"/>
         </w:rPr>
-        <w:t xml:space="preserve">People who are learning the basic mechanics of stock trading need a safe environment in which they can practice without risking money or providing real financial information. Existing brokerage platforms are designed for actual investment activity and may introduce unnecessary complexity, financial risk, and privacy concerns for a </w:t>
-      </w:r>
-      <w:proofErr w:type="gramStart"/>
+        <w:t>People who are learning the basic mechanics of stock trading need a safe environment in which they can practice without risking money or providing real financial information. Existing brokerage platforms are designed for actual investment activity and may introduce unnecessary complexity, financial risk, and privacy concerns for a beginning learner. A training system must therefore reproduce the essential activities involved in managing an investment portfolio while clearly separating the simulation from real-world trading.</w:t>
+      </w:r>
+    </w:p>
+    <w:p>
+      <w:pPr>
+        <w:ind w:firstLine="720"/>
+      </w:pPr>
       <w:r>
         <w:rPr>
           <w:color w:val="000000"/>
           <w:szCs w:val="24"/>
         </w:rPr>
-        <w:t>beginning learner</w:t>
-      </w:r>
-      <w:proofErr w:type="gramEnd"/>
-      <w:r>
+        <w:t>The proposed Stock Trading System will address this need by giving customers a centralized web application for managing simulated cash, locating available stocks, viewing generated stock prices, submitting buy and sell orders, reviewing pending orders, tracking holdings, and examining transaction history. The system must maintain accurate relationships among cash balances, stock holdings, orders, prices, and transaction records so that one action does not leave the simulated account in an inconsistent state. It must also support administrators who manage the available stock list and establish the market schedule used to determine whether an order executes immediately or remains pending. The application will not execute real trades or collect banking information, brokerage credentials, payment information, or other data associated with real financial accounts.</w:t>
+      </w:r>
+    </w:p>
+    <w:p>
+      <w:pPr>
+        <w:pStyle w:val="Heading2"/>
+      </w:pPr>
+      <w:bookmarkStart w:id="2" w:name="_Toc242716674"/>
+      <w:r>
+        <w:t>Technology Solution</w:t>
+      </w:r>
+      <w:bookmarkEnd w:id="2"/>
+    </w:p>
+    <w:p>
+      <w:pPr>
         <w:rPr>
           <w:color w:val="000000"/>
           <w:szCs w:val="24"/>
         </w:rPr>
-        <w:t>. A training system must therefore reproduce the essential activities involved in managing an investment portfolio while clearly separating the simulation from real-world trading.</w:t>
-      </w:r>
-    </w:p>
-    <w:p>
-      <w:pPr>
-        <w:ind w:firstLine="720"/>
       </w:pPr>
       <w:r>
         <w:rPr>
           <w:color w:val="000000"/>
           <w:szCs w:val="24"/>
         </w:rPr>
-        <w:t xml:space="preserve">The proposed Stock Trading System will address this need by giving customers a centralized web application for managing simulated cash, locating available </w:t>
-      </w:r>
-      <w:proofErr w:type="gramStart"/>
+        <w:t> </w:t>
+      </w:r>
       <w:r>
         <w:rPr>
           <w:color w:val="000000"/>
           <w:szCs w:val="24"/>
         </w:rPr>
-        <w:t>stocks</w:t>
-      </w:r>
-      <w:proofErr w:type="gramEnd"/>
+        <w:tab/>
+      </w:r>
       <w:r>
         <w:rPr>
           <w:color w:val="000000"/>
           <w:szCs w:val="24"/>
         </w:rPr>
-        <w:t>, viewing generated stock prices, submitting buy and sell orders, reviewing pending orders, tracking holdings, and examining transaction history. The system must maintain accurate relationships among cash balances, stock holdings, orders, prices, and transaction records so that one action does not leave the simulated account in an inconsistent state. It must also support administrators who manage the available stock list and establish the market schedule used to determine whether an order executes immediately or remains pending. The application will not execute real trades or collect banking information, brokerage credentials, payment information, or other data associated with real financial accounts.</w:t>
-      </w:r>
-    </w:p>
-    <w:p>
-      <w:pPr>
-        <w:pStyle w:val="Heading2"/>
-      </w:pPr>
-      <w:bookmarkStart w:id="2" w:name="_Toc240133556"/>
-      <w:r>
-        <w:t>Technology Solution</w:t>
-      </w:r>
-      <w:bookmarkEnd w:id="2"/>
-    </w:p>
-    <w:p>
-      <w:pPr>
+        <w:t xml:space="preserve"> </w:t>
+      </w:r>
+      <w:r>
         <w:rPr>
           <w:color w:val="000000"/>
           <w:szCs w:val="24"/>
         </w:rPr>
-      </w:pPr>
-      <w:r>
-        <w:rPr>
-          <w:color w:val="000000"/>
-          <w:szCs w:val="24"/>
-        </w:rPr>
-        <w:t> </w:t>
-      </w:r>
-      <w:r>
-        <w:rPr>
-          <w:color w:val="000000"/>
-          <w:szCs w:val="24"/>
-        </w:rPr>
-        <w:tab/>
-      </w:r>
-      <w:r>
-        <w:rPr>
-          <w:color w:val="000000"/>
-          <w:szCs w:val="24"/>
-        </w:rPr>
-        <w:t xml:space="preserve"> </w:t>
-      </w:r>
-      <w:r>
-        <w:rPr>
-          <w:color w:val="000000"/>
-          <w:szCs w:val="24"/>
-        </w:rPr>
-        <w:t xml:space="preserve">The team will develop a browser-based stock trading simulation as a single Django web application. Python and Django will provide </w:t>
-      </w:r>
-      <w:proofErr w:type="gramStart"/>
-      <w:r>
-        <w:rPr>
-          <w:color w:val="000000"/>
-          <w:szCs w:val="24"/>
-        </w:rPr>
-        <w:t>the server</w:t>
-      </w:r>
-      <w:proofErr w:type="gramEnd"/>
-      <w:r>
-        <w:rPr>
-          <w:color w:val="000000"/>
-          <w:szCs w:val="24"/>
-        </w:rPr>
-        <w:t xml:space="preserve">-side application logic, authentication, authorization, form processing, validation, database models, migrations, and automated testing. Django includes an object-relational mapper that allows relational models and their connections </w:t>
+        <w:t xml:space="preserve">The team will develop a browser-based stock trading simulation as a single Django web application. Python and Django will provide the server-side application logic, authentication, authorization, form processing, validation, database models, migrations, and automated testing. Django includes an object-relational mapper that allows relational models and their connections </w:t>
       </w:r>
       <w:r>
         <w:rPr>
@@ -3330,7 +3647,7 @@
       <w:pPr>
         <w:pStyle w:val="Heading1"/>
       </w:pPr>
-      <w:bookmarkStart w:id="3" w:name="_Toc240133557"/>
+      <w:bookmarkStart w:id="3" w:name="_Toc242716675"/>
       <w:r>
         <w:lastRenderedPageBreak/>
         <w:t>Process Maps</w:t>
@@ -3387,7 +3704,7 @@
           <w:noProof/>
         </w:rPr>
         <w:drawing>
-          <wp:inline distT="0" distB="0" distL="0" distR="0" wp14:anchorId="551B7042" wp14:editId="4D51D3FE">
+          <wp:inline distT="0" distB="0" distL="0" distR="0" wp14:anchorId="551B7042" wp14:editId="6506FE7B">
             <wp:extent cx="4105275" cy="3539484"/>
             <wp:effectExtent l="0" t="0" r="0" b="4445"/>
             <wp:docPr id="16981256" name="Picture 1"/>
@@ -3973,25 +4290,7 @@
           <w:bCs/>
           <w:szCs w:val="24"/>
         </w:rPr>
-        <w:t xml:space="preserve">This process shows how a customer selects an order and requests cancellation. The system verifies that the selected order still belongs to the customer and remains pending. An order that has already </w:t>
-      </w:r>
-      <w:proofErr w:type="gramStart"/>
-      <w:r>
-        <w:rPr>
-          <w:rFonts w:asciiTheme="majorHAnsi" w:eastAsiaTheme="majorEastAsia" w:hAnsiTheme="majorHAnsi" w:cstheme="majorHAnsi"/>
-          <w:bCs/>
-          <w:szCs w:val="24"/>
-        </w:rPr>
-        <w:t>executed</w:t>
-      </w:r>
-      <w:proofErr w:type="gramEnd"/>
-      <w:r>
-        <w:rPr>
-          <w:rFonts w:asciiTheme="majorHAnsi" w:eastAsiaTheme="majorEastAsia" w:hAnsiTheme="majorHAnsi" w:cstheme="majorHAnsi"/>
-          <w:bCs/>
-          <w:szCs w:val="24"/>
-        </w:rPr>
-        <w:t xml:space="preserve"> or been cancelled cannot be cancelled again. An eligible cancellation changes the order status to cancelled, releases any simulated cash or shares committed to the order, preserves the order record, and displays confirmation.</w:t>
+        <w:t>This process shows how a customer selects an order and requests cancellation. The system verifies that the selected order still belongs to the customer and remains pending. An order that has already executed or been cancelled cannot be cancelled again. An eligible cancellation changes the order status to cancelled, releases any simulated cash or shares committed to the order, preserves the order record, and displays confirmation.</w:t>
       </w:r>
     </w:p>
     <w:p>
@@ -4261,25 +4560,7 @@
           <w:bCs/>
           <w:szCs w:val="24"/>
         </w:rPr>
-        <w:t xml:space="preserve">Add </w:t>
-      </w:r>
-      <w:proofErr w:type="gramStart"/>
-      <w:r>
-        <w:rPr>
-          <w:rFonts w:asciiTheme="majorHAnsi" w:eastAsiaTheme="majorEastAsia" w:hAnsiTheme="majorHAnsi" w:cstheme="majorHAnsi"/>
-          <w:bCs/>
-          <w:szCs w:val="24"/>
-        </w:rPr>
-        <w:t>a stock</w:t>
-      </w:r>
-      <w:proofErr w:type="gramEnd"/>
-      <w:r>
-        <w:rPr>
-          <w:rFonts w:asciiTheme="majorHAnsi" w:eastAsiaTheme="majorEastAsia" w:hAnsiTheme="majorHAnsi" w:cstheme="majorHAnsi"/>
-          <w:bCs/>
-          <w:szCs w:val="24"/>
-        </w:rPr>
-        <w:t xml:space="preserve"> to the simulated market.</w:t>
+        <w:t>Add a stock to the simulated market.</w:t>
       </w:r>
     </w:p>
     <w:p>
@@ -4470,43 +4751,7 @@
           <w:bCs/>
           <w:szCs w:val="24"/>
         </w:rPr>
-        <w:t xml:space="preserve">This process shows how an administrator establishes the market’s opening time, closing time, trading days, </w:t>
-      </w:r>
-      <w:proofErr w:type="spellStart"/>
-      <w:r>
-        <w:rPr>
-          <w:rFonts w:asciiTheme="majorHAnsi" w:eastAsiaTheme="majorEastAsia" w:hAnsiTheme="majorHAnsi" w:cstheme="majorHAnsi"/>
-          <w:bCs/>
-          <w:szCs w:val="24"/>
-        </w:rPr>
-        <w:t>timezone</w:t>
-      </w:r>
-      <w:proofErr w:type="spellEnd"/>
-      <w:r>
-        <w:rPr>
-          <w:rFonts w:asciiTheme="majorHAnsi" w:eastAsiaTheme="majorEastAsia" w:hAnsiTheme="majorHAnsi" w:cstheme="majorHAnsi"/>
-          <w:bCs/>
-          <w:szCs w:val="24"/>
-        </w:rPr>
-        <w:t xml:space="preserve">, and exception dates. The system rejects invalid or overlapping schedules. A valid schedule becomes active and controls whether subsequently submitted orders </w:t>
-      </w:r>
-      <w:proofErr w:type="gramStart"/>
-      <w:r>
-        <w:rPr>
-          <w:rFonts w:asciiTheme="majorHAnsi" w:eastAsiaTheme="majorEastAsia" w:hAnsiTheme="majorHAnsi" w:cstheme="majorHAnsi"/>
-          <w:bCs/>
-          <w:szCs w:val="24"/>
-        </w:rPr>
-        <w:t>execute</w:t>
-      </w:r>
-      <w:proofErr w:type="gramEnd"/>
-      <w:r>
-        <w:rPr>
-          <w:rFonts w:asciiTheme="majorHAnsi" w:eastAsiaTheme="majorEastAsia" w:hAnsiTheme="majorHAnsi" w:cstheme="majorHAnsi"/>
-          <w:bCs/>
-          <w:szCs w:val="24"/>
-        </w:rPr>
-        <w:t xml:space="preserve"> immediately or remain pending.</w:t>
+        <w:t>This process shows how an administrator creates a stock by entering a ticker symbol, company name, positive initial price, positive whole-number share volume, and active status. The system validates the values and verifies that the ticker symbol is unique. Accepted information creates the stock with its starting simulated price, making an active stock available in the market listing.</w:t>
       </w:r>
     </w:p>
     <w:p>
@@ -4591,7 +4836,7 @@
       <w:pPr>
         <w:pStyle w:val="Heading1"/>
       </w:pPr>
-      <w:bookmarkStart w:id="4" w:name="_Toc240133558"/>
+      <w:bookmarkStart w:id="4" w:name="_Toc242716676"/>
       <w:r>
         <w:lastRenderedPageBreak/>
         <w:t>Requirements</w:t>
@@ -4602,7 +4847,7 @@
       <w:pPr>
         <w:pStyle w:val="Heading2"/>
       </w:pPr>
-      <w:bookmarkStart w:id="5" w:name="_Toc240133559"/>
+      <w:bookmarkStart w:id="5" w:name="_Toc242716677"/>
       <w:r>
         <w:t>Functional Requirements</w:t>
       </w:r>
@@ -4612,7 +4857,7 @@
       <w:pPr>
         <w:pStyle w:val="Heading3"/>
       </w:pPr>
-      <w:bookmarkStart w:id="6" w:name="_Toc240133560"/>
+      <w:bookmarkStart w:id="6" w:name="_Toc242716678"/>
       <w:r>
         <w:t>Customer Account and Authentication</w:t>
       </w:r>
@@ -4627,7 +4872,13 @@
         </w:numPr>
       </w:pPr>
       <w:r>
-        <w:t>FR-01: The system shall allow a new customer to create an account by providing a name, unique email address, unique username, and password.</w:t>
+        <w:t xml:space="preserve">FR-01: The system </w:t>
+      </w:r>
+      <w:r>
+        <w:t>will</w:t>
+      </w:r>
+      <w:r>
+        <w:t xml:space="preserve"> allow a new customer to create an account by providing a name, unique email address, unique username, and password.</w:t>
       </w:r>
     </w:p>
     <w:p>
@@ -4639,7 +4890,13 @@
         </w:numPr>
       </w:pPr>
       <w:r>
-        <w:t>FR-02: The system shall validate required registration fields and reject duplicate usernames or email addresses.</w:t>
+        <w:t xml:space="preserve">FR-02: The system </w:t>
+      </w:r>
+      <w:r>
+        <w:t>will</w:t>
+      </w:r>
+      <w:r>
+        <w:t xml:space="preserve"> validate required registration fields and reject duplicate usernames or email addresses.</w:t>
       </w:r>
     </w:p>
     <w:p>
@@ -4651,7 +4908,7 @@
         </w:numPr>
       </w:pPr>
       <w:r>
-        <w:t>FR-03: The system shall store passwords using Django’s password-hashing functions and shall never display or store plaintext passwords.</w:t>
+        <w:t>FR-03: The system will store passwords as secure hashes and will not store or display plaintext passwords.</w:t>
       </w:r>
     </w:p>
     <w:p>
@@ -4663,7 +4920,13 @@
         </w:numPr>
       </w:pPr>
       <w:r>
-        <w:t>FR-04: The system shall authenticate registered customers and administrators before granting access to protected functions.</w:t>
+        <w:t xml:space="preserve">FR-04: The system </w:t>
+      </w:r>
+      <w:r>
+        <w:t>will</w:t>
+      </w:r>
+      <w:r>
+        <w:t xml:space="preserve"> authenticate registered customers and administrators before granting access to protected functions.</w:t>
       </w:r>
     </w:p>
     <w:p>
@@ -4675,14 +4938,20 @@
         </w:numPr>
       </w:pPr>
       <w:r>
-        <w:t>FR-05: The system shall terminate the authenticated session when a customer or administrator signs out.</w:t>
+        <w:t xml:space="preserve">FR-05: The system </w:t>
+      </w:r>
+      <w:r>
+        <w:t>will</w:t>
+      </w:r>
+      <w:r>
+        <w:t xml:space="preserve"> terminate the authenticated session when a customer or administrator signs out.</w:t>
       </w:r>
     </w:p>
     <w:p>
       <w:pPr>
         <w:pStyle w:val="Heading3"/>
       </w:pPr>
-      <w:bookmarkStart w:id="7" w:name="_Toc240133561"/>
+      <w:bookmarkStart w:id="7" w:name="_Toc242716679"/>
       <w:r>
         <w:t>Simulated Cash Management</w:t>
       </w:r>
@@ -4697,7 +4966,13 @@
         </w:numPr>
       </w:pPr>
       <w:r>
-        <w:t>FR-06: The system shall display the customer’s available simulated cash balance.</w:t>
+        <w:t xml:space="preserve">FR-06: The system </w:t>
+      </w:r>
+      <w:r>
+        <w:t>will</w:t>
+      </w:r>
+      <w:r>
+        <w:t xml:space="preserve"> display the customer’s available simulated cash balance.</w:t>
       </w:r>
     </w:p>
     <w:p>
@@ -4709,7 +4984,13 @@
         </w:numPr>
       </w:pPr>
       <w:r>
-        <w:t>FR-07: The system shall allow a customer to deposit a positive simulated amount within configured limits.</w:t>
+        <w:t xml:space="preserve">FR-07: The system </w:t>
+      </w:r>
+      <w:r>
+        <w:t>will</w:t>
+      </w:r>
+      <w:r>
+        <w:t xml:space="preserve"> allow a customer to deposit a positive simulated amount within configured limits.</w:t>
       </w:r>
     </w:p>
     <w:p>
@@ -4721,15 +5002,13 @@
         </w:numPr>
       </w:pPr>
       <w:r>
-        <w:t xml:space="preserve">FR-08: The system shall allow a customer to withdraw a </w:t>
-      </w:r>
-      <w:proofErr w:type="gramStart"/>
-      <w:r>
-        <w:t>positive</w:t>
-      </w:r>
-      <w:proofErr w:type="gramEnd"/>
-      <w:r>
-        <w:t xml:space="preserve"> simulated amount that does not exceed available cash.</w:t>
+        <w:t xml:space="preserve">FR-08: The system </w:t>
+      </w:r>
+      <w:r>
+        <w:t>will</w:t>
+      </w:r>
+      <w:r>
+        <w:t xml:space="preserve"> allow a customer to withdraw a positive simulated amount that does not exceed available cash.</w:t>
       </w:r>
     </w:p>
     <w:p>
@@ -4741,7 +5020,13 @@
         </w:numPr>
       </w:pPr>
       <w:r>
-        <w:t>FR-09: The system shall record each deposit and withdrawal with its transaction type, amount, date and time, resulting balance, and associated customer account.</w:t>
+        <w:t xml:space="preserve">FR-09: The system </w:t>
+      </w:r>
+      <w:r>
+        <w:t>will</w:t>
+      </w:r>
+      <w:r>
+        <w:t xml:space="preserve"> record each deposit and withdrawal with its transaction type, amount, date and time, resulting balance, and associated customer account.</w:t>
       </w:r>
     </w:p>
     <w:p>
@@ -4753,22 +5038,20 @@
         </w:numPr>
       </w:pPr>
       <w:r>
-        <w:t xml:space="preserve">FR-10: The system shall reject zero, negative, </w:t>
-      </w:r>
-      <w:proofErr w:type="gramStart"/>
-      <w:r>
-        <w:t>nonnumeric</w:t>
-      </w:r>
-      <w:proofErr w:type="gramEnd"/>
-      <w:r>
-        <w:t>, overdrawn, or otherwise invalid cash transactions and display a clear validation message.</w:t>
+        <w:t xml:space="preserve">FR-10: The system </w:t>
+      </w:r>
+      <w:r>
+        <w:t>will</w:t>
+      </w:r>
+      <w:r>
+        <w:t xml:space="preserve"> reject zero, negative, nonnumeric, overdrawn, or otherwise invalid cash transactions and display a clear validation message.</w:t>
       </w:r>
     </w:p>
     <w:p>
       <w:pPr>
         <w:pStyle w:val="Heading3"/>
       </w:pPr>
-      <w:bookmarkStart w:id="8" w:name="_Toc240133562"/>
+      <w:bookmarkStart w:id="8" w:name="_Toc242716680"/>
       <w:r>
         <w:lastRenderedPageBreak/>
         <w:t>Stock Search and Price Display</w:t>
@@ -4784,15 +5067,13 @@
         </w:numPr>
       </w:pPr>
       <w:r>
-        <w:t xml:space="preserve">FR-11: The system shall allow customers to </w:t>
-      </w:r>
-      <w:proofErr w:type="gramStart"/>
-      <w:r>
-        <w:t>search</w:t>
-      </w:r>
-      <w:proofErr w:type="gramEnd"/>
-      <w:r>
-        <w:t xml:space="preserve"> active stocks by symbol or company name.</w:t>
+        <w:t xml:space="preserve">FR-11: The system </w:t>
+      </w:r>
+      <w:r>
+        <w:t>will</w:t>
+      </w:r>
+      <w:r>
+        <w:t xml:space="preserve"> allow customers to search active stocks by symbol or company name.</w:t>
       </w:r>
     </w:p>
     <w:p>
@@ -4804,7 +5085,7 @@
         </w:numPr>
       </w:pPr>
       <w:r>
-        <w:t>FR-12: The system shall display each matching stock’s symbol, company name, current simulated market price, and price change.</w:t>
+        <w:t>FR-12: The system will display each matching stock’s ticker symbol, company name, current simulated market price, price change, share volume, market capitalization, opening price, daily high price, and daily low price.</w:t>
       </w:r>
     </w:p>
     <w:p>
@@ -4816,7 +5097,13 @@
         </w:numPr>
       </w:pPr>
       <w:r>
-        <w:t>FR-13: The system shall use the custom random stock-price generator to update simulated prices and preserve the price records required for portfolio calculations and demonstrations.</w:t>
+        <w:t xml:space="preserve">FR-13: The system </w:t>
+      </w:r>
+      <w:r>
+        <w:t>will</w:t>
+      </w:r>
+      <w:r>
+        <w:t xml:space="preserve"> use the custom random stock-price generator to update simulated prices and preserve the price records required for portfolio calculations and demonstrations.</w:t>
       </w:r>
     </w:p>
     <w:p>
@@ -4828,14 +5115,20 @@
         </w:numPr>
       </w:pPr>
       <w:r>
-        <w:t>FR-14: The system shall clearly identify displayed stock prices, cash balances, portfolio values, and trading activity as simulated.</w:t>
+        <w:t xml:space="preserve">FR-14: The system </w:t>
+      </w:r>
+      <w:r>
+        <w:t>will</w:t>
+      </w:r>
+      <w:r>
+        <w:t xml:space="preserve"> clearly identify displayed stock prices, cash balances, portfolio values, and trading activity as simulated.</w:t>
       </w:r>
     </w:p>
     <w:p>
       <w:pPr>
         <w:pStyle w:val="Heading3"/>
       </w:pPr>
-      <w:bookmarkStart w:id="9" w:name="_Toc240133563"/>
+      <w:bookmarkStart w:id="9" w:name="_Toc242716681"/>
       <w:r>
         <w:t>Buy and Sell Orders</w:t>
       </w:r>
@@ -4850,7 +5143,13 @@
         </w:numPr>
       </w:pPr>
       <w:r>
-        <w:t>FR-15: The system shall allow an authenticated customer to submit a market buy order for a positive whole-number quantity of an active stock.</w:t>
+        <w:t xml:space="preserve">FR-15: The system </w:t>
+      </w:r>
+      <w:r>
+        <w:t>will</w:t>
+      </w:r>
+      <w:r>
+        <w:t xml:space="preserve"> allow an authenticated customer to submit a market buy order for a positive whole-number quantity of an active stock.</w:t>
       </w:r>
     </w:p>
     <w:p>
@@ -4862,7 +5161,13 @@
         </w:numPr>
       </w:pPr>
       <w:r>
-        <w:t>FR-16: The system shall prevent a buy order from executing or becoming pending when the customer lacks sufficient available simulated cash.</w:t>
+        <w:t xml:space="preserve">FR-16: The system </w:t>
+      </w:r>
+      <w:r>
+        <w:t>will</w:t>
+      </w:r>
+      <w:r>
+        <w:t xml:space="preserve"> prevent a buy order from executing or becoming pending when the customer lacks sufficient available simulated cash.</w:t>
       </w:r>
     </w:p>
     <w:p>
@@ -4874,7 +5179,13 @@
         </w:numPr>
       </w:pPr>
       <w:r>
-        <w:t>FR-17: The system shall allow an authenticated customer to submit a market sell order only when the customer holds the requested number of available shares.</w:t>
+        <w:t xml:space="preserve">FR-17: The system </w:t>
+      </w:r>
+      <w:r>
+        <w:t>will</w:t>
+      </w:r>
+      <w:r>
+        <w:t xml:space="preserve"> allow an authenticated customer to submit a market sell order only when the customer holds the requested number of available shares.</w:t>
       </w:r>
     </w:p>
     <w:p>
@@ -4886,15 +5197,13 @@
         </w:numPr>
       </w:pPr>
       <w:r>
-        <w:t xml:space="preserve">FR-18: The system shall use the current simulated stock price when an eligible market order </w:t>
-      </w:r>
-      <w:proofErr w:type="gramStart"/>
-      <w:r>
-        <w:t>executes</w:t>
-      </w:r>
-      <w:proofErr w:type="gramEnd"/>
-      <w:r>
-        <w:t>.</w:t>
+        <w:t xml:space="preserve">FR-18: The system </w:t>
+      </w:r>
+      <w:r>
+        <w:t>will</w:t>
+      </w:r>
+      <w:r>
+        <w:t xml:space="preserve"> use the current simulated stock price when an eligible market order executes.</w:t>
       </w:r>
     </w:p>
     <w:p>
@@ -4906,7 +5215,13 @@
         </w:numPr>
       </w:pPr>
       <w:r>
-        <w:t>FR-19: The system shall update cash activity, holdings, order status, and transaction history as one atomic database transaction when an order executes.</w:t>
+        <w:t xml:space="preserve">FR-19: The system </w:t>
+      </w:r>
+      <w:r>
+        <w:t>will</w:t>
+      </w:r>
+      <w:r>
+        <w:t xml:space="preserve"> update cash activity, holdings, order status, and transaction history as one atomic database transaction when an order executes.</w:t>
       </w:r>
     </w:p>
     <w:p>
@@ -4918,16 +5233,22 @@
         </w:numPr>
       </w:pPr>
       <w:r>
-        <w:t>FR-20: The system shall record an otherwise valid order as pending when it is submitted outside configured market hours.</w:t>
+        <w:lastRenderedPageBreak/>
+        <w:t xml:space="preserve">FR-20: The system </w:t>
+      </w:r>
+      <w:r>
+        <w:t>will</w:t>
+      </w:r>
+      <w:r>
+        <w:t xml:space="preserve"> record an otherwise valid order as pending when it is submitted outside configured market hours.</w:t>
       </w:r>
     </w:p>
     <w:p>
       <w:pPr>
         <w:pStyle w:val="Heading3"/>
       </w:pPr>
-      <w:bookmarkStart w:id="10" w:name="_Toc240133564"/>
-      <w:r>
-        <w:lastRenderedPageBreak/>
+      <w:bookmarkStart w:id="10" w:name="_Toc242716682"/>
+      <w:r>
         <w:t>Pending Orders and Cancellation</w:t>
       </w:r>
       <w:bookmarkEnd w:id="10"/>
@@ -4941,15 +5262,13 @@
         </w:numPr>
       </w:pPr>
       <w:r>
-        <w:t xml:space="preserve">FR-21: The system shall display each customer’s pending orders with the creation time, stock, order side, quantity, estimated value, and </w:t>
-      </w:r>
-      <w:proofErr w:type="gramStart"/>
-      <w:r>
-        <w:t>current status</w:t>
-      </w:r>
-      <w:proofErr w:type="gramEnd"/>
-      <w:r>
-        <w:t>.</w:t>
+        <w:t xml:space="preserve">FR-21: The system </w:t>
+      </w:r>
+      <w:r>
+        <w:t>will</w:t>
+      </w:r>
+      <w:r>
+        <w:t xml:space="preserve"> display each customer’s pending orders with the creation time, stock, order side, quantity, estimated value, and current status.</w:t>
       </w:r>
     </w:p>
     <w:p>
@@ -4961,7 +5280,13 @@
         </w:numPr>
       </w:pPr>
       <w:r>
-        <w:t>FR-22: The system shall allow a customer to request cancellation only for an order that belongs to that customer and remains pending.</w:t>
+        <w:t xml:space="preserve">FR-22: The system </w:t>
+      </w:r>
+      <w:r>
+        <w:t>will</w:t>
+      </w:r>
+      <w:r>
+        <w:t xml:space="preserve"> allow a customer to request cancellation only for an order that belongs to that customer and remains pending.</w:t>
       </w:r>
     </w:p>
     <w:p>
@@ -4973,7 +5298,13 @@
         </w:numPr>
       </w:pPr>
       <w:r>
-        <w:t>FR-23: The system shall release simulated cash or shares committed to an order when that pending order is successfully cancelled.</w:t>
+        <w:t xml:space="preserve">FR-23: The system </w:t>
+      </w:r>
+      <w:r>
+        <w:t>will</w:t>
+      </w:r>
+      <w:r>
+        <w:t xml:space="preserve"> release simulated cash or shares committed to an order when that pending order is successfully cancelled.</w:t>
       </w:r>
     </w:p>
     <w:p>
@@ -4985,14 +5316,20 @@
         </w:numPr>
       </w:pPr>
       <w:r>
-        <w:t>FR-24: The system shall retain cancelled orders in transaction history with a cancelled status.</w:t>
+        <w:t xml:space="preserve">FR-24: The system </w:t>
+      </w:r>
+      <w:r>
+        <w:t>will</w:t>
+      </w:r>
+      <w:r>
+        <w:t xml:space="preserve"> retain cancelled orders in transaction history with a cancelled status.</w:t>
       </w:r>
     </w:p>
     <w:p>
       <w:pPr>
         <w:pStyle w:val="Heading3"/>
       </w:pPr>
-      <w:bookmarkStart w:id="11" w:name="_Toc240133565"/>
+      <w:bookmarkStart w:id="11" w:name="_Toc242716683"/>
       <w:r>
         <w:t>Portfolio and Transaction History</w:t>
       </w:r>
@@ -5007,7 +5344,13 @@
         </w:numPr>
       </w:pPr>
       <w:r>
-        <w:t>FR-25: The system shall display each customer’s holdings with the stock symbol, quantity, average cost, current simulated price, current value, and simulated gain or loss.</w:t>
+        <w:t xml:space="preserve">FR-25: The system </w:t>
+      </w:r>
+      <w:r>
+        <w:t>will</w:t>
+      </w:r>
+      <w:r>
+        <w:t xml:space="preserve"> display each customer’s holdings with the stock symbol, quantity, average cost, current simulated price, current value, and simulated gain or loss.</w:t>
       </w:r>
     </w:p>
     <w:p>
@@ -5019,7 +5362,13 @@
         </w:numPr>
       </w:pPr>
       <w:r>
-        <w:t>FR-26: The system shall calculate the customer’s total portfolio value from available simulated cash and the current value of all holdings.</w:t>
+        <w:t xml:space="preserve">FR-26: The system </w:t>
+      </w:r>
+      <w:r>
+        <w:t>will</w:t>
+      </w:r>
+      <w:r>
+        <w:t xml:space="preserve"> calculate the customer’s total portfolio value from available simulated cash and the current value of all holdings.</w:t>
       </w:r>
     </w:p>
     <w:p>
@@ -5031,7 +5380,13 @@
         </w:numPr>
       </w:pPr>
       <w:r>
-        <w:t>FR-27: The system shall display transaction history for deposits, withdrawals, purchases, sales, and cancellations.</w:t>
+        <w:t xml:space="preserve">FR-27: The system </w:t>
+      </w:r>
+      <w:r>
+        <w:t>will</w:t>
+      </w:r>
+      <w:r>
+        <w:t xml:space="preserve"> display transaction history for deposits, withdrawals, purchases, sales, and cancellations.</w:t>
       </w:r>
     </w:p>
     <w:p>
@@ -5043,14 +5398,20 @@
         </w:numPr>
       </w:pPr>
       <w:r>
-        <w:t>FR-28: The system shall allow customers to filter transaction history by transaction type and date range.</w:t>
+        <w:t xml:space="preserve">FR-28: The system </w:t>
+      </w:r>
+      <w:r>
+        <w:t>will</w:t>
+      </w:r>
+      <w:r>
+        <w:t xml:space="preserve"> allow customers to filter transaction history by transaction type and date range.</w:t>
       </w:r>
     </w:p>
     <w:p>
       <w:pPr>
         <w:pStyle w:val="Heading3"/>
       </w:pPr>
-      <w:bookmarkStart w:id="12" w:name="_Toc240133566"/>
+      <w:bookmarkStart w:id="12" w:name="_Toc242716684"/>
       <w:r>
         <w:t>Administrator Stock Management</w:t>
       </w:r>
@@ -5065,7 +5426,8 @@
         </w:numPr>
       </w:pPr>
       <w:r>
-        <w:t>FR-29: The system shall allow an authenticated administrator to create a stock with a unique symbol, company name, positive opening price, and active status.</w:t>
+        <w:lastRenderedPageBreak/>
+        <w:t>FR-29: The system will allow an authenticated administrator to create a stock with a unique ticker symbol, company name, positive initial price, positive whole-number share volume, and active status.</w:t>
       </w:r>
     </w:p>
     <w:p>
@@ -5077,7 +5439,13 @@
         </w:numPr>
       </w:pPr>
       <w:r>
-        <w:t>FR-30: The system shall reject duplicate stock symbols and invalid stock values.</w:t>
+        <w:t xml:space="preserve">FR-30: The system </w:t>
+      </w:r>
+      <w:r>
+        <w:t>will</w:t>
+      </w:r>
+      <w:r>
+        <w:t xml:space="preserve"> reject duplicate stock symbols and invalid stock values.</w:t>
       </w:r>
     </w:p>
     <w:p>
@@ -5089,8 +5457,13 @@
         </w:numPr>
       </w:pPr>
       <w:r>
-        <w:lastRenderedPageBreak/>
-        <w:t>FR-31: The system shall allow an administrator to edit a stock’s company name and active status without changing its historical price, order, holding, or transaction records.</w:t>
+        <w:t xml:space="preserve">FR-31: The system </w:t>
+      </w:r>
+      <w:r>
+        <w:t>will</w:t>
+      </w:r>
+      <w:r>
+        <w:t xml:space="preserve"> allow an administrator to edit a stock’s company name and active status without changing its historical price, order, holding, or transaction records.</w:t>
       </w:r>
     </w:p>
     <w:p>
@@ -5102,14 +5475,20 @@
         </w:numPr>
       </w:pPr>
       <w:r>
-        <w:t>FR-32: The system shall prevent customers and unauthenticated users from accessing administrator stock-management functions.</w:t>
+        <w:t xml:space="preserve">FR-32: The system </w:t>
+      </w:r>
+      <w:r>
+        <w:t>will</w:t>
+      </w:r>
+      <w:r>
+        <w:t xml:space="preserve"> prevent customers and unauthenticated users from accessing administrator stock-management functions.</w:t>
       </w:r>
     </w:p>
     <w:p>
       <w:pPr>
         <w:pStyle w:val="Heading3"/>
       </w:pPr>
-      <w:bookmarkStart w:id="13" w:name="_Toc240133567"/>
+      <w:bookmarkStart w:id="13" w:name="_Toc242716685"/>
       <w:r>
         <w:t>Administrator Market Scheduling</w:t>
       </w:r>
@@ -5124,15 +5503,13 @@
         </w:numPr>
       </w:pPr>
       <w:r>
-        <w:t xml:space="preserve">FR-33: The system shall allow an authenticated administrator to configure the market opening time, closing time, trading days, and </w:t>
-      </w:r>
-      <w:proofErr w:type="spellStart"/>
-      <w:r>
-        <w:t>timezone</w:t>
-      </w:r>
-      <w:proofErr w:type="spellEnd"/>
-      <w:r>
-        <w:t>.</w:t>
+        <w:t xml:space="preserve">FR-33: The system </w:t>
+      </w:r>
+      <w:r>
+        <w:t>will</w:t>
+      </w:r>
+      <w:r>
+        <w:t xml:space="preserve"> allow an authenticated administrator to configure the market opening time, closing time, trading days, and timezone.</w:t>
       </w:r>
     </w:p>
     <w:p>
@@ -5144,7 +5521,13 @@
         </w:numPr>
       </w:pPr>
       <w:r>
-        <w:t>FR-34: The system shall allow an administrator to create exception dates for simulated market closures or modified trading hours.</w:t>
+        <w:t xml:space="preserve">FR-34: The system </w:t>
+      </w:r>
+      <w:r>
+        <w:t>will</w:t>
+      </w:r>
+      <w:r>
+        <w:t xml:space="preserve"> allow an administrator to create exception dates for simulated market closures or modified trading hours.</w:t>
       </w:r>
     </w:p>
     <w:p>
@@ -5156,7 +5539,13 @@
         </w:numPr>
       </w:pPr>
       <w:r>
-        <w:t>FR-35: The system shall reject schedules in which the closing time does not follow the opening time or active schedules improperly overlap.</w:t>
+        <w:t xml:space="preserve">FR-35: The system </w:t>
+      </w:r>
+      <w:r>
+        <w:t>will</w:t>
+      </w:r>
+      <w:r>
+        <w:t xml:space="preserve"> reject schedules in which the closing time does not follow the opening time or active schedules improperly overlap.</w:t>
       </w:r>
     </w:p>
     <w:p>
@@ -5168,7 +5557,13 @@
         </w:numPr>
       </w:pPr>
       <w:r>
-        <w:t>FR-36: The system shall use the active market schedule to determine whether a valid order executes immediately or remains pending.</w:t>
+        <w:t xml:space="preserve">FR-36: The system </w:t>
+      </w:r>
+      <w:r>
+        <w:t>will</w:t>
+      </w:r>
+      <w:r>
+        <w:t xml:space="preserve"> use the active market schedule to determine whether a valid order executes immediately or remains pending.</w:t>
       </w:r>
     </w:p>
     <w:p>
@@ -5180,14 +5575,20 @@
         </w:numPr>
       </w:pPr>
       <w:r>
-        <w:t>FR-37: The system shall prevent customers and unauthenticated users from changing the market schedule.</w:t>
+        <w:t xml:space="preserve">FR-37: The system </w:t>
+      </w:r>
+      <w:r>
+        <w:t>will</w:t>
+      </w:r>
+      <w:r>
+        <w:t xml:space="preserve"> prevent customers and unauthenticated users from changing the market schedule.</w:t>
       </w:r>
     </w:p>
     <w:p>
       <w:pPr>
         <w:pStyle w:val="Heading2"/>
       </w:pPr>
-      <w:bookmarkStart w:id="14" w:name="_Toc240133568"/>
+      <w:bookmarkStart w:id="14" w:name="_Toc242716686"/>
       <w:r>
         <w:t>Nonfunctional Requirements</w:t>
       </w:r>
@@ -5202,7 +5603,7 @@
         </w:numPr>
       </w:pPr>
       <w:r>
-        <w:t>NFR-01 Security: The system shall enforce role-based authorization for customer and administrator functions and apply Django protections for cross-site request forgery, session handling, password storage, and common injection attacks.</w:t>
+        <w:t>NFR-01 Security: The system will enforce customer and administrator permissions and protect credentials, authenticated sessions, and submitted data against unauthorized access or modification.</w:t>
       </w:r>
     </w:p>
     <w:p>
@@ -5214,7 +5615,20 @@
         </w:numPr>
       </w:pPr>
       <w:r>
-        <w:t>NFR-02 Privacy: The system shall collect only the account information needed for the training simulation and shall not request banking information, brokerage credentials, payment information, or real financial-account data.</w:t>
+        <w:lastRenderedPageBreak/>
+        <w:t xml:space="preserve">NFR-02 Privacy: The system </w:t>
+      </w:r>
+      <w:r>
+        <w:t>will</w:t>
+      </w:r>
+      <w:r>
+        <w:t xml:space="preserve"> collect only the account information needed for the training simulation and </w:t>
+      </w:r>
+      <w:r>
+        <w:t>will</w:t>
+      </w:r>
+      <w:r>
+        <w:t xml:space="preserve"> not request banking information, brokerage credentials, payment information, or real financial-account data.</w:t>
       </w:r>
     </w:p>
     <w:p>
@@ -5226,8 +5640,13 @@
         </w:numPr>
       </w:pPr>
       <w:r>
-        <w:lastRenderedPageBreak/>
-        <w:t>NFR-03 Data Integrity: Database constraints and atomic transactions shall prevent negative balances, negative holdings, duplicate stock symbols, and partially completed trades.</w:t>
+        <w:t xml:space="preserve">NFR-03 Data Integrity: Database constraints and atomic transactions </w:t>
+      </w:r>
+      <w:r>
+        <w:t>will</w:t>
+      </w:r>
+      <w:r>
+        <w:t xml:space="preserve"> prevent negative balances, negative holdings, duplicate stock symbols, and partially completed trades.</w:t>
       </w:r>
     </w:p>
     <w:p>
@@ -5239,7 +5658,19 @@
         </w:numPr>
       </w:pPr>
       <w:r>
-        <w:t>NFR-04 Availability: The hosted application shall provide a clear error or maintenance response when a service is unavailable and shall use recoverable database backups appropriate to the course deployment.</w:t>
+        <w:t xml:space="preserve">NFR-04 Availability: The hosted application </w:t>
+      </w:r>
+      <w:r>
+        <w:t>will</w:t>
+      </w:r>
+      <w:r>
+        <w:t xml:space="preserve"> provide a clear error or maintenance response when a service is unavailable and </w:t>
+      </w:r>
+      <w:r>
+        <w:t>will</w:t>
+      </w:r>
+      <w:r>
+        <w:t xml:space="preserve"> use recoverable database backups appropriate to the course deployment.</w:t>
       </w:r>
     </w:p>
     <w:p>
@@ -5263,7 +5694,13 @@
         </w:numPr>
       </w:pPr>
       <w:r>
-        <w:t>NFR-06 Usability: Customer and administrator pages shall use consistent navigation, readable labels, visible validation messages, and confirmation before destructive actions.</w:t>
+        <w:t xml:space="preserve">NFR-06 Usability: Customer and administrator pages </w:t>
+      </w:r>
+      <w:r>
+        <w:t>will</w:t>
+      </w:r>
+      <w:r>
+        <w:t xml:space="preserve"> use consistent navigation, readable labels, visible validation messages, and confirmation before destructive actions.</w:t>
       </w:r>
     </w:p>
     <w:p>
@@ -5275,7 +5712,13 @@
         </w:numPr>
       </w:pPr>
       <w:r>
-        <w:t>NFR-07 Accessibility: Application pages shall support keyboard navigation, programmatically associated form labels, sufficient color contrast, and information that does not depend on color alone.</w:t>
+        <w:t xml:space="preserve">NFR-07 Accessibility: Application pages </w:t>
+      </w:r>
+      <w:r>
+        <w:t>will</w:t>
+      </w:r>
+      <w:r>
+        <w:t xml:space="preserve"> support keyboard navigation, programmatically associated form labels, sufficient color contrast, and information that does not depend on color alone.</w:t>
       </w:r>
     </w:p>
     <w:p>
@@ -5287,7 +5730,19 @@
         </w:numPr>
       </w:pPr>
       <w:r>
-        <w:t>NFR-08 Compatibility: The application shall support current desktop versions of Chrome, Edge, and Firefox and shall remain usable at common tablet and mobile display widths.</w:t>
+        <w:t xml:space="preserve">NFR-08 Compatibility: The application </w:t>
+      </w:r>
+      <w:r>
+        <w:t>will</w:t>
+      </w:r>
+      <w:r>
+        <w:t xml:space="preserve"> support current desktop versions of Chrome, Edge, and Firefox and </w:t>
+      </w:r>
+      <w:r>
+        <w:t>will</w:t>
+      </w:r>
+      <w:r>
+        <w:t xml:space="preserve"> remain usable at common tablet and mobile display widths.</w:t>
       </w:r>
     </w:p>
     <w:p>
@@ -5299,7 +5754,7 @@
         </w:numPr>
       </w:pPr>
       <w:r>
-        <w:t>NFR-09 Maintainability: The Django project shall separate models, forms, views, templates, tests, and configuration according to a documented and consistent project structure.</w:t>
+        <w:t>NFR-09 Maintainability: The system will organize application responsibilities into documented components so that changes to one function can be reviewed and tested independently.</w:t>
       </w:r>
     </w:p>
     <w:p>
@@ -5311,7 +5766,8 @@
         </w:numPr>
       </w:pPr>
       <w:r>
-        <w:t>NFR-10 Testability: Automated Django tests shall cover authentication, authorization, validation, cash and holding rules, order execution, cancellation, price generation, and market scheduling.</w:t>
+        <w:lastRenderedPageBreak/>
+        <w:t>NFR-10 Testability: The system will support automated verification of authentication, authorization, validation, cash and holding rules, order execution, cancellation, price generation, and market scheduling.</w:t>
       </w:r>
     </w:p>
     <w:p>
@@ -5323,16 +5779,13 @@
         </w:numPr>
       </w:pPr>
       <w:r>
-        <w:lastRenderedPageBreak/>
-        <w:t xml:space="preserve">NFR-11 Auditability: The system shall </w:t>
-      </w:r>
-      <w:proofErr w:type="gramStart"/>
-      <w:r>
-        <w:t>timestamp</w:t>
-      </w:r>
-      <w:proofErr w:type="gramEnd"/>
-      <w:r>
-        <w:t xml:space="preserve"> account-changing events and retain order, cash-transaction, and price records needed to review simulation results during testing and demonstrations.</w:t>
+        <w:t xml:space="preserve">NFR-11 Auditability: The system </w:t>
+      </w:r>
+      <w:r>
+        <w:t>will</w:t>
+      </w:r>
+      <w:r>
+        <w:t xml:space="preserve"> timestamp account-changing events and retain order, cash-transaction, and price records needed to review simulation results during testing and demonstrations.</w:t>
       </w:r>
     </w:p>
     <w:p>
@@ -5344,14 +5797,26 @@
         </w:numPr>
       </w:pPr>
       <w:r>
-        <w:t>NFR-12 Simulation Boundary: Every page that displays cash, portfolio values, stock prices, or trades shall identify them as simulated and shall not present the application as a real brokerage service.</w:t>
+        <w:t xml:space="preserve">NFR-12 Simulation Boundary: Every page that displays cash, portfolio values, stock prices, or trades </w:t>
+      </w:r>
+      <w:r>
+        <w:t>will</w:t>
+      </w:r>
+      <w:r>
+        <w:t xml:space="preserve"> identify them as simulated and </w:t>
+      </w:r>
+      <w:r>
+        <w:t>will</w:t>
+      </w:r>
+      <w:r>
+        <w:t xml:space="preserve"> not present the application as a real brokerage service.</w:t>
       </w:r>
     </w:p>
     <w:p>
       <w:pPr>
         <w:pStyle w:val="Heading2"/>
       </w:pPr>
-      <w:bookmarkStart w:id="15" w:name="_Toc240133569"/>
+      <w:bookmarkStart w:id="15" w:name="_Toc242716687"/>
       <w:r>
         <w:t>Business Rules</w:t>
       </w:r>
@@ -5366,7 +5831,13 @@
         </w:numPr>
       </w:pPr>
       <w:r>
-        <w:t>BR-01: Each newly created customer account shall begin with $25,000 in simulated cash.</w:t>
+        <w:t xml:space="preserve">BR-01: Each newly created customer account </w:t>
+      </w:r>
+      <w:r>
+        <w:t>will</w:t>
+      </w:r>
+      <w:r>
+        <w:t xml:space="preserve"> begin with $25,000 in simulated cash.</w:t>
       </w:r>
     </w:p>
     <w:p>
@@ -5378,7 +5849,13 @@
         </w:numPr>
       </w:pPr>
       <w:r>
-        <w:t>BR-02: Each customer account shall have one simulated portfolio.</w:t>
+        <w:t xml:space="preserve">BR-02: Each customer account </w:t>
+      </w:r>
+      <w:r>
+        <w:t>will</w:t>
+      </w:r>
+      <w:r>
+        <w:t xml:space="preserve"> have one simulated portfolio.</w:t>
       </w:r>
     </w:p>
     <w:p>
@@ -5390,7 +5867,7 @@
         </w:numPr>
       </w:pPr>
       <w:r>
-        <w:t>BR-03: Customers and administrators shall use the same underlying Django user-account structure, with permissions distinguishing the two roles.</w:t>
+        <w:t>BR-03: The system will distinguish customer and administrator access through assigned permissions.</w:t>
       </w:r>
     </w:p>
     <w:p>
@@ -5402,7 +5879,7 @@
         </w:numPr>
       </w:pPr>
       <w:r>
-        <w:t>BR-04: Administrator accounts shall be created through controlled Django administrative tools and shall not be available through public registration.</w:t>
+        <w:t>BR-04: The system will restrict administrator account creation to authorized administrative personnel and prevent public registration from granting administrator privileges.</w:t>
       </w:r>
     </w:p>
     <w:p>
@@ -5414,7 +5891,7 @@
         </w:numPr>
       </w:pPr>
       <w:r>
-        <w:t>BR-05: Simulated prices shall be updated by the custom random-price generator when the application requests or evaluates a current price. The system shall not require a continuously running trading service.</w:t>
+        <w:t>BR-05: The system will evaluate whether a simulated price update is due when a current price is requested and will apply eligible updates through the custom random-price generator.</w:t>
       </w:r>
     </w:p>
     <w:p>
@@ -5426,7 +5903,13 @@
         </w:numPr>
       </w:pPr>
       <w:r>
-        <w:t>BR-06: Available simulated cash shall exclude funds committed to pending buy orders.</w:t>
+        <w:t xml:space="preserve">BR-06: Available simulated cash </w:t>
+      </w:r>
+      <w:r>
+        <w:t>will</w:t>
+      </w:r>
+      <w:r>
+        <w:t xml:space="preserve"> exclude funds committed to pending buy orders.</w:t>
       </w:r>
     </w:p>
     <w:p>
@@ -5438,7 +5921,13 @@
         </w:numPr>
       </w:pPr>
       <w:r>
-        <w:t>BR-07: Available shares shall exclude shares committed to pending sell orders.</w:t>
+        <w:t xml:space="preserve">BR-07: Available shares </w:t>
+      </w:r>
+      <w:r>
+        <w:t>will</w:t>
+      </w:r>
+      <w:r>
+        <w:t xml:space="preserve"> exclude shares committed to pending sell orders.</w:t>
       </w:r>
     </w:p>
     <w:p>
@@ -5450,7 +5939,8 @@
         </w:numPr>
       </w:pPr>
       <w:r>
-        <w:t>BR-08: An order shall use one record that progresses through pending, executed, or cancelled status. The system shall not require a separate execution entity.</w:t>
+        <w:lastRenderedPageBreak/>
+        <w:t>BR-08: The system will retain each order’s identity and history as its status changes between pending, executed, and cancelled.</w:t>
       </w:r>
     </w:p>
     <w:p>
@@ -5462,7 +5952,13 @@
         </w:numPr>
       </w:pPr>
       <w:r>
-        <w:t>BR-09: Deactivating a stock shall prevent new orders for that stock while preserving existing holdings, prices, orders, and transaction history.</w:t>
+        <w:t xml:space="preserve">BR-09: Deactivating a stock </w:t>
+      </w:r>
+      <w:r>
+        <w:t>will</w:t>
+      </w:r>
+      <w:r>
+        <w:t xml:space="preserve"> prevent new orders for that stock while preserving existing holdings, prices, orders, and transaction history.</w:t>
       </w:r>
     </w:p>
     <w:p>
@@ -5474,8 +5970,13 @@
         </w:numPr>
       </w:pPr>
       <w:r>
-        <w:lastRenderedPageBreak/>
-        <w:t>BR-10: Cash changes caused by deposits, withdrawals, purchases, sales, reservations, and releases shall be recorded or calculated from auditable system records.</w:t>
+        <w:t xml:space="preserve">BR-10: Cash changes caused by deposits, withdrawals, purchases, sales, reservations, and releases </w:t>
+      </w:r>
+      <w:r>
+        <w:t>will</w:t>
+      </w:r>
+      <w:r>
+        <w:t xml:space="preserve"> be recorded or calculated from auditable system records.</w:t>
       </w:r>
     </w:p>
     <w:p>
@@ -5487,7 +5988,13 @@
         </w:numPr>
       </w:pPr>
       <w:r>
-        <w:t>BR-11: A valid pending order shall be evaluated against the active market schedule and current simulated price before execution.</w:t>
+        <w:t xml:space="preserve">BR-11: A valid pending order </w:t>
+      </w:r>
+      <w:r>
+        <w:t>will</w:t>
+      </w:r>
+      <w:r>
+        <w:t xml:space="preserve"> be evaluated against the active market schedule and current simulated price before execution.</w:t>
       </w:r>
     </w:p>
     <w:p>
@@ -5499,26 +6006,69 @@
         </w:numPr>
       </w:pPr>
       <w:r>
-        <w:t xml:space="preserve">BR-12: The regular market schedule shall use a defined </w:t>
-      </w:r>
-      <w:proofErr w:type="spellStart"/>
-      <w:r>
-        <w:t>timezone</w:t>
-      </w:r>
-      <w:proofErr w:type="spellEnd"/>
-      <w:r>
-        <w:t xml:space="preserve"> and may be modified by administrator-created exception dates.</w:t>
+        <w:t>BR-12: The system will apply the defined market timezone when evaluating trading hours and will apply administrator-created exception dates to override the regular schedule.</w:t>
+      </w:r>
+    </w:p>
+    <w:p>
+      <w:pPr>
+        <w:pStyle w:val="Heading2"/>
+      </w:pPr>
+      <w:bookmarkStart w:id="16" w:name="_Toc242716688"/>
+      <w:r>
+        <w:t>Stock Data Definitions</w:t>
+      </w:r>
+      <w:bookmarkEnd w:id="16"/>
+    </w:p>
+    <w:p>
+      <w:pPr>
+        <w:ind w:firstLine="360"/>
+      </w:pPr>
+      <w:r>
+        <w:t>The system will interpret share volume as the total number of simulated shares represented by a stock, rather than the number traded during a day.</w:t>
+      </w:r>
+    </w:p>
+    <w:p>
+      <w:pPr>
+        <w:ind w:firstLine="360"/>
+      </w:pPr>
+      <w:r>
+        <w:t>The system will calculate market capitalization by multiplying share volume by the current simulated price.</w:t>
+      </w:r>
+    </w:p>
+    <w:p>
+      <w:pPr>
+        <w:ind w:firstLine="360"/>
+      </w:pPr>
+      <w:r>
+        <w:t>The system will use the administrator-entered initial price as the stock’s starting simulated price.</w:t>
+      </w:r>
+    </w:p>
+    <w:p>
+      <w:pPr>
+        <w:ind w:firstLine="360"/>
+      </w:pPr>
+      <w:r>
+        <w:t>The system will identify each market day using the configured market timezone. The opening price will be the first simulated price established for that market day. The daily high and daily low will be the highest and lowest simulated prices established during that day, including the opening price.</w:t>
+      </w:r>
+    </w:p>
+    <w:p>
+      <w:pPr>
+        <w:ind w:firstLine="360"/>
+      </w:pPr>
+      <w:r>
+        <w:lastRenderedPageBreak/>
+        <w:t>Before a stock has a recorded market day, the system will display its initial price as the opening, high, and low reference values. After a recorded market day, those values will remain visible until the next market day begins.</w:t>
       </w:r>
     </w:p>
     <w:p>
       <w:pPr>
         <w:pStyle w:val="Heading1"/>
       </w:pPr>
-      <w:bookmarkStart w:id="16" w:name="_Toc240133570"/>
+      <w:bookmarkStart w:id="17" w:name="_Toc242716689"/>
       <w:r>
         <w:t>User Interface</w:t>
       </w:r>
-      <w:bookmarkEnd w:id="16"/>
+      <w:bookmarkEnd w:id="17"/>
     </w:p>
     <w:p>
       <w:r>
@@ -5556,7 +6106,7 @@
       <w:pPr>
         <w:pStyle w:val="Heading2"/>
       </w:pPr>
-      <w:bookmarkStart w:id="17" w:name="_Toc240133571"/>
+      <w:bookmarkStart w:id="18" w:name="_Toc242716690"/>
       <w:r>
         <w:lastRenderedPageBreak/>
         <w:t>Wireframe 1</w:t>
@@ -5567,7 +6117,7 @@
       <w:r>
         <w:t>Account Registration and Sign In</w:t>
       </w:r>
-      <w:bookmarkEnd w:id="17"/>
+      <w:bookmarkEnd w:id="18"/>
     </w:p>
     <w:p>
       <w:r>
@@ -5660,7 +6210,7 @@
       <w:pPr>
         <w:pStyle w:val="Heading2"/>
       </w:pPr>
-      <w:bookmarkStart w:id="18" w:name="_Toc240133572"/>
+      <w:bookmarkStart w:id="19" w:name="_Toc242716691"/>
       <w:r>
         <w:lastRenderedPageBreak/>
         <w:t xml:space="preserve">Wireframe 2: </w:t>
@@ -5668,7 +6218,7 @@
       <w:r>
         <w:t>Cash Management</w:t>
       </w:r>
-      <w:bookmarkEnd w:id="18"/>
+      <w:bookmarkEnd w:id="19"/>
     </w:p>
     <w:p>
       <w:r>
@@ -5686,15 +6236,7 @@
         <w:t>:</w:t>
       </w:r>
       <w:r>
-        <w:t xml:space="preserve"> This mockup provides a summary of the customer’s available simulated cash, funds committed to pending </w:t>
-      </w:r>
-      <w:proofErr w:type="gramStart"/>
-      <w:r>
-        <w:t>orders, and</w:t>
-      </w:r>
-      <w:proofErr w:type="gramEnd"/>
-      <w:r>
-        <w:t xml:space="preserve"> resulting buying power. Deposit and withdrawal controls appear below the summary so the customer can enter an amount and select the intended transaction type.</w:t>
+        <w:t xml:space="preserve"> This mockup provides a summary of the customer’s available simulated cash, funds committed to pending orders, and resulting buying power. Deposit and withdrawal controls appear below the summary so the customer can enter an amount and select the intended transaction type.</w:t>
       </w:r>
     </w:p>
     <w:p>
@@ -5767,7 +6309,7 @@
       <w:pPr>
         <w:pStyle w:val="Heading2"/>
       </w:pPr>
-      <w:bookmarkStart w:id="19" w:name="_Toc240133573"/>
+      <w:bookmarkStart w:id="20" w:name="_Toc242716692"/>
       <w:r>
         <w:lastRenderedPageBreak/>
         <w:t>Wire</w:t>
@@ -5778,7 +6320,7 @@
       <w:r>
         <w:t>Market Search and Trade Ticket</w:t>
       </w:r>
-      <w:bookmarkEnd w:id="19"/>
+      <w:bookmarkEnd w:id="20"/>
     </w:p>
     <w:p>
       <w:r>
@@ -5786,32 +6328,13 @@
           <w:b/>
           <w:bCs/>
         </w:rPr>
-        <w:t>Description</w:t>
-      </w:r>
-      <w:r>
-        <w:rPr>
-          <w:b/>
-          <w:bCs/>
-        </w:rPr>
-        <w:t>:</w:t>
-      </w:r>
-      <w:r>
-        <w:rPr>
-          <w:b/>
-          <w:bCs/>
-        </w:rPr>
-        <w:t xml:space="preserve"> </w:t>
-      </w:r>
-      <w:r>
-        <w:t xml:space="preserve">This mockup allows a customer to </w:t>
-      </w:r>
-      <w:proofErr w:type="gramStart"/>
-      <w:r>
-        <w:t>search</w:t>
-      </w:r>
-      <w:proofErr w:type="gramEnd"/>
-      <w:r>
-        <w:t xml:space="preserve"> active stocks by symbol or company name. Search results display the stock symbol, company name, current simulated price, and price change. Selecting a stock opens a trade ticket without requiring the customer to leave the market-search page.</w:t>
+        <w:t xml:space="preserve">Description: </w:t>
+      </w:r>
+      <w:r>
+        <w:t>This mockup allows a customer to search active stocks by ticker symbol or company name. Stock information will display the ticker symbol, company name, current simulated price, price change, share volume, market capitalization, opening price, daily high price, and daily low price. Selecting a stock provides access to a trade ticket for entering the order side and a positive whole-share quantity</w:t>
+      </w:r>
+      <w:r>
+        <w:t>.</w:t>
       </w:r>
     </w:p>
     <w:p>
@@ -5819,15 +6342,7 @@
         <w:ind w:firstLine="720"/>
       </w:pPr>
       <w:r>
-        <w:t xml:space="preserve">The trade ticket allows the customer to select Buy or Sell, enter a positive whole-number quantity, review the current simulated price, and view an estimated order total before submission. The application will validate available cash or shares, depending on the order type. The submitted order will either </w:t>
-      </w:r>
-      <w:proofErr w:type="gramStart"/>
-      <w:r>
-        <w:t>execute</w:t>
-      </w:r>
-      <w:proofErr w:type="gramEnd"/>
-      <w:r>
-        <w:t xml:space="preserve"> at the current simulated price or display a pending status depending on the market schedule.</w:t>
+        <w:t>The trade ticket allows the customer to select Buy or Sell, enter a positive whole-number quantity, review the current simulated price, and view an estimated order total before submission. The application will validate available cash or shares, depending on the order type. The submitted order will either execute at the current simulated price or display a pending status depending on the market schedule.</w:t>
       </w:r>
     </w:p>
     <w:p>
@@ -5903,12 +6418,12 @@
       <w:pPr>
         <w:pStyle w:val="Heading2"/>
       </w:pPr>
-      <w:bookmarkStart w:id="20" w:name="_Toc240133574"/>
+      <w:bookmarkStart w:id="21" w:name="_Toc242716693"/>
       <w:r>
         <w:lastRenderedPageBreak/>
         <w:t>Wireframe 4: Pending Orders</w:t>
       </w:r>
-      <w:bookmarkEnd w:id="20"/>
+      <w:bookmarkEnd w:id="21"/>
     </w:p>
     <w:p>
       <w:r>
@@ -5992,7 +6507,7 @@
       <w:pPr>
         <w:pStyle w:val="Heading2"/>
       </w:pPr>
-      <w:bookmarkStart w:id="21" w:name="_Toc240133575"/>
+      <w:bookmarkStart w:id="22" w:name="_Toc242716694"/>
       <w:r>
         <w:lastRenderedPageBreak/>
         <w:t xml:space="preserve">Wireframe 5: </w:t>
@@ -6000,7 +6515,7 @@
       <w:r>
         <w:t>Portfolio and Transaction History</w:t>
       </w:r>
-      <w:bookmarkEnd w:id="21"/>
+      <w:bookmarkEnd w:id="22"/>
     </w:p>
     <w:p>
       <w:r>
@@ -6079,14 +6594,14 @@
       <w:pPr>
         <w:pStyle w:val="Heading2"/>
       </w:pPr>
-      <w:bookmarkStart w:id="22" w:name="_Toc240133576"/>
+      <w:bookmarkStart w:id="23" w:name="_Toc242716695"/>
       <w:r>
         <w:t xml:space="preserve">Wireframe 6: </w:t>
       </w:r>
       <w:r>
         <w:t>Administrator Stock Management</w:t>
       </w:r>
-      <w:bookmarkEnd w:id="22"/>
+      <w:bookmarkEnd w:id="23"/>
     </w:p>
     <w:p>
       <w:r>
@@ -6097,11 +6612,14 @@
         <w:t>Description</w:t>
       </w:r>
       <w:r>
-        <w:t xml:space="preserve">: This protected mockup allows an administrator to create and maintain stocks used by the simulation. The creation form collects a stock symbol, company name, positive opening </w:t>
+        <w:t xml:space="preserve">: </w:t>
+      </w:r>
+      <w:r>
+        <w:t xml:space="preserve">This protected mockup allows an administrator to create and maintain stocks used by the simulation. The creation form will collect a unique ticker symbol, company name, </w:t>
       </w:r>
       <w:r>
         <w:lastRenderedPageBreak/>
-        <w:t>price, and active status. The adjacent table displays existing stocks and provides an editing action.</w:t>
+        <w:t>positive initial price, positive whole-number share volume, and active status. The stock listing will display existing stocks and provide an editing action.</w:t>
       </w:r>
     </w:p>
     <w:p>
@@ -6109,7 +6627,13 @@
         <w:ind w:firstLine="720"/>
       </w:pPr>
       <w:r>
-        <w:t>The interface will reject duplicate symbols and invalid opening prices. Deactivating a stock prevents new orders without deleting existing holdings, price history, orders, or transaction records. Customers and unauthenticated users will not be permitted to access this page.</w:t>
+        <w:t xml:space="preserve">The interface will reject duplicate symbols and </w:t>
+      </w:r>
+      <w:r>
+        <w:t>invalid initial prices or share volumes</w:t>
+      </w:r>
+      <w:r>
+        <w:t>. Deactivating a stock prevents new orders without deleting existing holdings, price history, orders, or transaction records. Customers and unauthenticated users will not be permitted to access this page.</w:t>
       </w:r>
     </w:p>
     <w:p>
@@ -6163,14 +6687,14 @@
       <w:pPr>
         <w:pStyle w:val="Heading2"/>
       </w:pPr>
-      <w:bookmarkStart w:id="23" w:name="_Toc240133577"/>
+      <w:bookmarkStart w:id="24" w:name="_Toc242716696"/>
       <w:r>
         <w:t xml:space="preserve">Wireframe 7: </w:t>
       </w:r>
       <w:r>
         <w:t>Administrator Market Schedule</w:t>
       </w:r>
-      <w:bookmarkEnd w:id="23"/>
+      <w:bookmarkEnd w:id="24"/>
     </w:p>
     <w:p>
       <w:r>
@@ -6198,11 +6722,8 @@
         <w:ind w:firstLine="720"/>
       </w:pPr>
       <w:r>
-        <w:t xml:space="preserve">The interface will reject closing times that do not follow opening times and schedules that improperly overlap. Once saved, the active schedule determines whether an eligible order </w:t>
-      </w:r>
-      <w:r>
         <w:lastRenderedPageBreak/>
-        <w:t>executes immediately or remains pending. Customers and unauthenticated users will not be permitted to modify these settings.</w:t>
+        <w:t>The interface will reject closing times that do not follow opening times and schedules that improperly overlap. Once saved, the active schedule determines whether an eligible order executes immediately or remains pending. Customers and unauthenticated users will not be permitted to modify these settings.</w:t>
       </w:r>
     </w:p>
     <w:p>
@@ -6256,24 +6777,24 @@
       <w:pPr>
         <w:pStyle w:val="Heading1"/>
       </w:pPr>
-      <w:bookmarkStart w:id="24" w:name="_Toc240133578"/>
+      <w:bookmarkStart w:id="25" w:name="_Toc242716697"/>
       <w:r>
         <w:t>Infrastructure Architecture</w:t>
       </w:r>
-      <w:bookmarkEnd w:id="24"/>
+      <w:bookmarkEnd w:id="25"/>
     </w:p>
     <w:p>
       <w:pPr>
         <w:pStyle w:val="Heading2"/>
       </w:pPr>
-      <w:bookmarkStart w:id="25" w:name="_Toc240133579"/>
+      <w:bookmarkStart w:id="26" w:name="_Toc242716698"/>
       <w:r>
         <w:t>Infrastructure</w:t>
       </w:r>
       <w:r>
         <w:t xml:space="preserve"> Topology</w:t>
       </w:r>
-      <w:bookmarkEnd w:id="25"/>
+      <w:bookmarkEnd w:id="26"/>
       <w:r>
         <w:t xml:space="preserve"> </w:t>
       </w:r>
@@ -6326,20 +6847,20 @@
         <w:rPr>
           <w:shd w:val="clear" w:color="auto" w:fill="FFFFFF"/>
         </w:rPr>
-        <w:t xml:space="preserve">Customers and administrators will access the application through a web browser over HTTPS. The browser will communicate with the Django application, which will handle authentication, validation, business logic, and webpage generation. </w:t>
+        <w:t xml:space="preserve">Customers and administrators will access the application through a web browser over HTTPS. The browser will communicate with the Django application, which will handle </w:t>
       </w:r>
       <w:r>
         <w:rPr>
           <w:shd w:val="clear" w:color="auto" w:fill="FFFFFF"/>
         </w:rPr>
-        <w:t xml:space="preserve">Django will access the hosted </w:t>
+        <w:lastRenderedPageBreak/>
+        <w:t xml:space="preserve">authentication, validation, business logic, and webpage generation. </w:t>
       </w:r>
       <w:r>
         <w:rPr>
           <w:shd w:val="clear" w:color="auto" w:fill="FFFFFF"/>
         </w:rPr>
-        <w:lastRenderedPageBreak/>
-        <w:t>MySQL database through its object-relational mapper.</w:t>
+        <w:t>Django will access the hosted MySQL database through its object-relational mapper.</w:t>
       </w:r>
       <w:r>
         <w:rPr>
@@ -6473,22 +6994,22 @@
       <w:pPr>
         <w:pStyle w:val="Heading1"/>
       </w:pPr>
-      <w:bookmarkStart w:id="26" w:name="_Toc240133580"/>
+      <w:bookmarkStart w:id="27" w:name="_Toc242716699"/>
       <w:r>
         <w:lastRenderedPageBreak/>
         <w:t>Information Architecture</w:t>
       </w:r>
-      <w:bookmarkEnd w:id="26"/>
+      <w:bookmarkEnd w:id="27"/>
     </w:p>
     <w:p>
       <w:pPr>
         <w:pStyle w:val="Heading2"/>
       </w:pPr>
-      <w:bookmarkStart w:id="27" w:name="_Toc240133581"/>
+      <w:bookmarkStart w:id="28" w:name="_Toc242716700"/>
       <w:r>
         <w:t>Entity Relationship Diagram</w:t>
       </w:r>
-      <w:bookmarkEnd w:id="27"/>
+      <w:bookmarkEnd w:id="28"/>
       <w:r>
         <w:t xml:space="preserve"> </w:t>
       </w:r>
@@ -6694,7 +7215,6 @@
                 <w:szCs w:val="24"/>
               </w:rPr>
             </w:pPr>
-            <w:proofErr w:type="spellStart"/>
             <w:r>
               <w:rPr>
                 <w:rFonts w:ascii="Times New Roman" w:eastAsia="Times New Roman" w:hAnsi="Times New Roman" w:cs="Times New Roman"/>
@@ -6703,7 +7223,6 @@
               </w:rPr>
               <w:t>CashTransaction</w:t>
             </w:r>
-            <w:proofErr w:type="spellEnd"/>
           </w:p>
         </w:tc>
         <w:tc>
@@ -6782,7 +7301,7 @@
                 <w:color w:val="auto"/>
                 <w:szCs w:val="24"/>
               </w:rPr>
-              <w:t>Stores each simulated stock’s unique symbol, company name, current price, and active status.</w:t>
+              <w:t>Stores each simulated stock’s unique ticker symbol, company name, share volume, initial price, current price, and active status. Share volume and current price support the market capitalization calculation.</w:t>
             </w:r>
           </w:p>
         </w:tc>
@@ -6803,7 +7322,6 @@
                 <w:szCs w:val="24"/>
               </w:rPr>
             </w:pPr>
-            <w:proofErr w:type="spellStart"/>
             <w:r>
               <w:rPr>
                 <w:rFonts w:ascii="Times New Roman" w:eastAsia="Times New Roman" w:hAnsi="Times New Roman" w:cs="Times New Roman"/>
@@ -6812,7 +7330,6 @@
               </w:rPr>
               <w:t>PriceHistory</w:t>
             </w:r>
-            <w:proofErr w:type="spellEnd"/>
           </w:p>
         </w:tc>
         <w:tc>
@@ -6836,25 +7353,7 @@
                 <w:color w:val="auto"/>
                 <w:szCs w:val="24"/>
               </w:rPr>
-              <w:t xml:space="preserve">Preserves generated prices associated with </w:t>
-            </w:r>
-            <w:proofErr w:type="gramStart"/>
-            <w:r>
-              <w:rPr>
-                <w:rFonts w:ascii="Times New Roman" w:eastAsia="Times New Roman" w:hAnsi="Times New Roman" w:cs="Times New Roman"/>
-                <w:color w:val="auto"/>
-                <w:szCs w:val="24"/>
-              </w:rPr>
-              <w:t>a stock</w:t>
-            </w:r>
-            <w:proofErr w:type="gramEnd"/>
-            <w:r>
-              <w:rPr>
-                <w:rFonts w:ascii="Times New Roman" w:eastAsia="Times New Roman" w:hAnsi="Times New Roman" w:cs="Times New Roman"/>
-                <w:color w:val="auto"/>
-                <w:szCs w:val="24"/>
-              </w:rPr>
-              <w:t xml:space="preserve"> and the time each price was recorded.</w:t>
+              <w:t>Preserves generated prices associated with a stock and the time each price was recorded.</w:t>
             </w:r>
           </w:p>
         </w:tc>
@@ -6985,7 +7484,6 @@
                 <w:szCs w:val="24"/>
               </w:rPr>
             </w:pPr>
-            <w:proofErr w:type="spellStart"/>
             <w:r>
               <w:rPr>
                 <w:rFonts w:ascii="Times New Roman" w:eastAsia="Times New Roman" w:hAnsi="Times New Roman" w:cs="Times New Roman"/>
@@ -6994,7 +7492,6 @@
               </w:rPr>
               <w:t>MarketSchedule</w:t>
             </w:r>
-            <w:proofErr w:type="spellEnd"/>
           </w:p>
         </w:tc>
         <w:tc>
@@ -7018,25 +7515,7 @@
                 <w:color w:val="auto"/>
                 <w:szCs w:val="24"/>
               </w:rPr>
-              <w:t xml:space="preserve">Defines regular opening and closing times, trading days, and the applicable </w:t>
-            </w:r>
-            <w:proofErr w:type="spellStart"/>
-            <w:r>
-              <w:rPr>
-                <w:rFonts w:ascii="Times New Roman" w:eastAsia="Times New Roman" w:hAnsi="Times New Roman" w:cs="Times New Roman"/>
-                <w:color w:val="auto"/>
-                <w:szCs w:val="24"/>
-              </w:rPr>
-              <w:t>timezone</w:t>
-            </w:r>
-            <w:proofErr w:type="spellEnd"/>
-            <w:r>
-              <w:rPr>
-                <w:rFonts w:ascii="Times New Roman" w:eastAsia="Times New Roman" w:hAnsi="Times New Roman" w:cs="Times New Roman"/>
-                <w:color w:val="auto"/>
-                <w:szCs w:val="24"/>
-              </w:rPr>
-              <w:t>.</w:t>
+              <w:t>Defines regular opening and closing times, trading days, and the applicable timezone.</w:t>
             </w:r>
           </w:p>
         </w:tc>
@@ -7057,7 +7536,6 @@
                 <w:szCs w:val="24"/>
               </w:rPr>
             </w:pPr>
-            <w:proofErr w:type="spellStart"/>
             <w:r>
               <w:rPr>
                 <w:rFonts w:ascii="Times New Roman" w:eastAsia="Times New Roman" w:hAnsi="Times New Roman" w:cs="Times New Roman"/>
@@ -7066,7 +7544,6 @@
               </w:rPr>
               <w:t>MarketException</w:t>
             </w:r>
-            <w:proofErr w:type="spellEnd"/>
           </w:p>
         </w:tc>
         <w:tc>
@@ -7101,24 +7578,16 @@
       <w:pPr>
         <w:pStyle w:val="Heading2"/>
       </w:pPr>
-      <w:bookmarkStart w:id="28" w:name="_Toc240133582"/>
+      <w:bookmarkStart w:id="29" w:name="_Toc242716701"/>
       <w:r>
         <w:t>Relationships</w:t>
       </w:r>
-      <w:bookmarkEnd w:id="28"/>
+      <w:bookmarkEnd w:id="29"/>
     </w:p>
     <w:p>
       <w:r>
         <w:tab/>
-        <w:t xml:space="preserve">A User can have many cash transactions, orders, and holdings. Each </w:t>
-      </w:r>
-      <w:proofErr w:type="spellStart"/>
-      <w:r>
-        <w:t>CashTransaction</w:t>
-      </w:r>
-      <w:proofErr w:type="spellEnd"/>
-      <w:r>
-        <w:t xml:space="preserve"> belongs to one User, and each Order belongs to one User and references one Stock. A User and Stock combination identifies a customer’s Holding, allowing the system to maintain the quantity and average cost of each owned stock.</w:t>
+        <w:t>A User can have many cash transactions, orders, and holdings. Each CashTransaction belongs to one User, and each Order belongs to one User and references one Stock. A User and Stock combination identifies a customer’s Holding, allowing the system to maintain the quantity and average cost of each owned stock.</w:t>
       </w:r>
     </w:p>
     <w:p>
@@ -7126,23 +7595,7 @@
         <w:ind w:firstLine="720"/>
       </w:pPr>
       <w:r>
-        <w:t xml:space="preserve">A Stock can appear in many orders, holdings, and price-history records. These relationships allow the system to preserve trading history and recalculate portfolio values when simulated stock prices change. A </w:t>
-      </w:r>
-      <w:proofErr w:type="spellStart"/>
-      <w:r>
-        <w:t>MarketSchedule</w:t>
-      </w:r>
-      <w:proofErr w:type="spellEnd"/>
-      <w:r>
-        <w:t xml:space="preserve"> can have multiple </w:t>
-      </w:r>
-      <w:proofErr w:type="spellStart"/>
-      <w:r>
-        <w:t>MarketException</w:t>
-      </w:r>
-      <w:proofErr w:type="spellEnd"/>
-      <w:r>
-        <w:t xml:space="preserve"> records for holidays, closures, or modified hours. The active schedule governs order-execution eligibility, but an individual order does not require a direct foreign-key relationship to the schedule.</w:t>
+        <w:t>A Stock can appear in many orders, holdings, and price-history records. These relationships allow the system to preserve trading history and recalculate portfolio values when simulated stock prices change. A MarketSchedule can have multiple MarketException records for holidays, closures, or modified hours. The active schedule governs order-execution eligibility, but an individual order does not require a direct foreign-key relationship to the schedule.</w:t>
       </w:r>
     </w:p>
     <w:p>
@@ -7150,30 +7603,22 @@
         <w:ind w:firstLine="720"/>
       </w:pPr>
       <w:r>
-        <w:t xml:space="preserve">Primary and foreign keys will enforce </w:t>
-      </w:r>
-      <w:proofErr w:type="gramStart"/>
-      <w:r>
-        <w:t>the defined</w:t>
-      </w:r>
-      <w:proofErr w:type="gramEnd"/>
-      <w:r>
-        <w:t xml:space="preserve"> relationships. Additional uniqueness and validation constraints will prevent duplicate usernames, email addresses, stock symbols, and duplicate holdings for the same user and stock. The application will calculate available simulated </w:t>
+        <w:t xml:space="preserve">Primary and foreign keys will enforce the defined relationships. Additional uniqueness and validation constraints will prevent duplicate usernames, email addresses, stock symbols, and </w:t>
       </w:r>
       <w:r>
         <w:lastRenderedPageBreak/>
-        <w:t>cash from recorded cash activity and executed orders while subtracting funds committed to pending buy orders. Available shares will likewise exclude shares committed to pending sell orders.</w:t>
+        <w:t>duplicate holdings for the same user and stock. The application will calculate available simulated cash from recorded cash activity and executed orders while subtracting funds committed to pending buy orders. Available shares will likewise exclude shares committed to pending sell orders.</w:t>
       </w:r>
     </w:p>
     <w:p>
       <w:pPr>
         <w:pStyle w:val="Heading1"/>
       </w:pPr>
-      <w:bookmarkStart w:id="29" w:name="_Toc240133583"/>
+      <w:bookmarkStart w:id="30" w:name="_Toc242716702"/>
       <w:r>
         <w:t>Security and Privacy Architecture</w:t>
       </w:r>
-      <w:bookmarkEnd w:id="29"/>
+      <w:bookmarkEnd w:id="30"/>
     </w:p>
     <w:p>
       <w:r>
@@ -7543,6 +7988,7 @@
         <w:rPr>
           <w:shd w:val="clear" w:color="auto" w:fill="FFFFFF"/>
         </w:rPr>
+        <w:lastRenderedPageBreak/>
         <w:br w:type="page"/>
       </w:r>
     </w:p>
@@ -7553,7 +7999,7 @@
           <w:shd w:val="clear" w:color="auto" w:fill="FFFFFF"/>
         </w:rPr>
       </w:pPr>
-      <w:bookmarkStart w:id="30" w:name="_Toc240133584"/>
+      <w:bookmarkStart w:id="31" w:name="_Toc242716703"/>
       <w:r>
         <w:rPr>
           <w:shd w:val="clear" w:color="auto" w:fill="FFFFFF"/>
@@ -7561,7 +8007,7 @@
         <w:lastRenderedPageBreak/>
         <w:t>Privacy Boundaries</w:t>
       </w:r>
-      <w:bookmarkEnd w:id="30"/>
+      <w:bookmarkEnd w:id="31"/>
     </w:p>
     <w:p>
       <w:r>
@@ -7581,11 +8027,11 @@
       <w:pPr>
         <w:pStyle w:val="Heading1"/>
       </w:pPr>
-      <w:bookmarkStart w:id="31" w:name="_Toc240133585"/>
+      <w:bookmarkStart w:id="32" w:name="_Toc242716704"/>
       <w:r>
         <w:t>Programming</w:t>
       </w:r>
-      <w:bookmarkEnd w:id="31"/>
+      <w:bookmarkEnd w:id="32"/>
     </w:p>
     <w:p>
       <w:r>
@@ -7599,11 +8045,11 @@
       <w:pPr>
         <w:pStyle w:val="Heading2"/>
       </w:pPr>
-      <w:bookmarkStart w:id="32" w:name="_Toc240133586"/>
+      <w:bookmarkStart w:id="33" w:name="_Toc242716705"/>
       <w:r>
         <w:t>Programing Languages</w:t>
       </w:r>
-      <w:bookmarkEnd w:id="32"/>
+      <w:bookmarkEnd w:id="33"/>
     </w:p>
     <w:tbl>
       <w:tblPr>
@@ -7937,25 +8383,7 @@
                 <w:color w:val="auto"/>
                 <w:szCs w:val="24"/>
               </w:rPr>
-              <w:t xml:space="preserve">Represents the relational database technology underlying SQLite and MySQL. Most database operations will be performed through </w:t>
-            </w:r>
-            <w:proofErr w:type="gramStart"/>
-            <w:r>
-              <w:rPr>
-                <w:rFonts w:ascii="Times New Roman" w:eastAsia="Times New Roman" w:hAnsi="Times New Roman" w:cs="Times New Roman"/>
-                <w:color w:val="auto"/>
-                <w:szCs w:val="24"/>
-              </w:rPr>
-              <w:t>the Django</w:t>
-            </w:r>
-            <w:proofErr w:type="gramEnd"/>
-            <w:r>
-              <w:rPr>
-                <w:rFonts w:ascii="Times New Roman" w:eastAsia="Times New Roman" w:hAnsi="Times New Roman" w:cs="Times New Roman"/>
-                <w:color w:val="auto"/>
-                <w:szCs w:val="24"/>
-              </w:rPr>
-              <w:t xml:space="preserve"> ORM rather than manually written SQL.</w:t>
+              <w:t>Represents the relational database technology underlying SQLite and MySQL. Most database operations will be performed through the Django ORM rather than manually written SQL.</w:t>
             </w:r>
           </w:p>
         </w:tc>
@@ -7966,11 +8394,11 @@
       <w:pPr>
         <w:pStyle w:val="Heading2"/>
       </w:pPr>
-      <w:bookmarkStart w:id="33" w:name="_Toc240133587"/>
+      <w:bookmarkStart w:id="34" w:name="_Toc242716706"/>
       <w:r>
         <w:t>Framework and Development Tools</w:t>
       </w:r>
-      <w:bookmarkEnd w:id="33"/>
+      <w:bookmarkEnd w:id="34"/>
     </w:p>
     <w:tbl>
       <w:tblPr>
@@ -8248,25 +8676,7 @@
                 <w:color w:val="auto"/>
                 <w:szCs w:val="24"/>
               </w:rPr>
-              <w:t xml:space="preserve">Tracks </w:t>
-            </w:r>
-            <w:proofErr w:type="gramStart"/>
-            <w:r>
-              <w:rPr>
-                <w:rFonts w:ascii="Times New Roman" w:eastAsia="Times New Roman" w:hAnsi="Times New Roman" w:cs="Times New Roman"/>
-                <w:color w:val="auto"/>
-                <w:szCs w:val="24"/>
-              </w:rPr>
-              <w:t>changes</w:t>
-            </w:r>
-            <w:proofErr w:type="gramEnd"/>
-            <w:r>
-              <w:rPr>
-                <w:rFonts w:ascii="Times New Roman" w:eastAsia="Times New Roman" w:hAnsi="Times New Roman" w:cs="Times New Roman"/>
-                <w:color w:val="auto"/>
-                <w:szCs w:val="24"/>
-              </w:rPr>
-              <w:t xml:space="preserve"> locally and supports branching, commits, and version history.</w:t>
+              <w:t>Tracks changes locally and supports branching, commits, and version history.</w:t>
             </w:r>
           </w:p>
         </w:tc>
@@ -8622,12 +9032,12 @@
       <w:pPr>
         <w:pStyle w:val="Heading1"/>
       </w:pPr>
-      <w:bookmarkStart w:id="34" w:name="_Toc240133588"/>
+      <w:bookmarkStart w:id="35" w:name="_Toc242716707"/>
       <w:r>
         <w:lastRenderedPageBreak/>
         <w:t>References</w:t>
       </w:r>
-      <w:bookmarkEnd w:id="34"/>
+      <w:bookmarkEnd w:id="35"/>
     </w:p>
     <w:p>
       <w:pPr>
@@ -8641,93 +9051,77 @@
           <w:i/>
           <w:iCs/>
         </w:rPr>
-        <w:t xml:space="preserve">Django </w:t>
-      </w:r>
-      <w:proofErr w:type="gramStart"/>
+        <w:t>Django at a glance: Django documentation</w:t>
+      </w:r>
+      <w:r>
+        <w:t xml:space="preserve">. Django Project. https://docs.djangoproject.com/en/5.2/intro/overview/ </w:t>
+      </w:r>
+    </w:p>
+    <w:p>
+      <w:pPr>
+        <w:ind w:left="720" w:hanging="720"/>
+      </w:pPr>
+      <w:r>
+        <w:t xml:space="preserve">Django Software Foundation. (n.d.-b). </w:t>
+      </w:r>
       <w:r>
         <w:rPr>
           <w:i/>
           <w:iCs/>
         </w:rPr>
-        <w:t>at a glance</w:t>
-      </w:r>
-      <w:proofErr w:type="gramEnd"/>
+        <w:t xml:space="preserve">Security in </w:t>
+      </w:r>
       <w:r>
         <w:rPr>
           <w:i/>
           <w:iCs/>
         </w:rPr>
-        <w:t>: Django documentation</w:t>
-      </w:r>
-      <w:r>
-        <w:t xml:space="preserve">. Django Project. https://docs.djangoproject.com/en/5.2/intro/overview/ </w:t>
-      </w:r>
-    </w:p>
-    <w:p>
-      <w:pPr>
-        <w:ind w:left="720" w:hanging="720"/>
-      </w:pPr>
-      <w:r>
-        <w:t xml:space="preserve">Django Software Foundation. (n.d.-b). </w:t>
+        <w:t>Django</w:t>
       </w:r>
       <w:r>
         <w:rPr>
           <w:i/>
           <w:iCs/>
         </w:rPr>
-        <w:t xml:space="preserve">Security in </w:t>
+        <w:t>: Django documentation</w:t>
+      </w:r>
+      <w:r>
+        <w:t xml:space="preserve">. Django Project. https://docs.djangoproject.com/en/5.2/topics/security/ </w:t>
+      </w:r>
+    </w:p>
+    <w:p>
+      <w:pPr>
+        <w:ind w:left="720" w:hanging="720"/>
+      </w:pPr>
+      <w:r>
+        <w:t xml:space="preserve">PythonAnywhere. (2016, February 10). </w:t>
       </w:r>
       <w:r>
         <w:rPr>
           <w:i/>
           <w:iCs/>
         </w:rPr>
-        <w:t>Django</w:t>
+        <w:t xml:space="preserve">Deploying an existing </w:t>
       </w:r>
       <w:r>
         <w:rPr>
           <w:i/>
           <w:iCs/>
         </w:rPr>
-        <w:t>: Django documentation</w:t>
-      </w:r>
-      <w:r>
-        <w:t xml:space="preserve">. Django Project. https://docs.djangoproject.com/en/5.2/topics/security/ </w:t>
-      </w:r>
-    </w:p>
-    <w:p>
-      <w:pPr>
-        <w:ind w:left="720" w:hanging="720"/>
-      </w:pPr>
-      <w:r>
-        <w:t xml:space="preserve">PythonAnywhere. (2016, February 10). </w:t>
+        <w:t>Django</w:t>
       </w:r>
       <w:r>
         <w:rPr>
           <w:i/>
           <w:iCs/>
         </w:rPr>
-        <w:t xml:space="preserve">Deploying an existing </w:t>
+        <w:t xml:space="preserve"> project on </w:t>
       </w:r>
       <w:r>
         <w:rPr>
           <w:i/>
           <w:iCs/>
         </w:rPr>
-        <w:t>Django</w:t>
-      </w:r>
-      <w:r>
-        <w:rPr>
-          <w:i/>
-          <w:iCs/>
-        </w:rPr>
-        <w:t xml:space="preserve"> project on </w:t>
-      </w:r>
-      <w:r>
-        <w:rPr>
-          <w:i/>
-          <w:iCs/>
-        </w:rPr>
         <w:t>PythonAnywhere</w:t>
       </w:r>
       <w:r>
@@ -8744,14 +9138,22 @@
       <w:pPr>
         <w:pStyle w:val="Heading1"/>
       </w:pPr>
+      <w:bookmarkStart w:id="36" w:name="_Toc242716708"/>
       <w:r>
         <w:lastRenderedPageBreak/>
         <w:t>Addendum</w:t>
       </w:r>
-    </w:p>
-    <w:p>
-      <w:r>
-        <w:t>This addendum records decisions and documentation changes adopted after the Systems Analysis and Design document was submitted on September 13, 2026. The original submitted sections remain unchanged. Future changes will be added as consecutively numbered entries so the repository history and this document together preserve when each decision was made.</w:t>
+      <w:bookmarkEnd w:id="36"/>
+    </w:p>
+    <w:p>
+      <w:r>
+        <w:t xml:space="preserve">This addendum records decisions and documentation changes adopted after the Systems Analysis and Design document was submitted on September 13, 2026. </w:t>
+      </w:r>
+      <w:r>
+        <w:t>The original submitted SAD is preserved separately. This amended copy contains the team’s current requirements and subsequent decisions.</w:t>
+      </w:r>
+      <w:r>
+        <w:t xml:space="preserve"> Future changes will be added as consecutively numbered entries so the repository history and this document together preserve when each decision was made.</w:t>
       </w:r>
     </w:p>
     <w:p>
@@ -8759,9 +9161,11 @@
         <w:pStyle w:val="Heading2"/>
         <w:keepNext/>
       </w:pPr>
+      <w:bookmarkStart w:id="37" w:name="_Toc242716709"/>
       <w:r>
         <w:t>Revision History</w:t>
       </w:r>
+      <w:bookmarkEnd w:id="37"/>
     </w:p>
     <w:tbl>
       <w:tblPr>
@@ -8999,9 +9403,11 @@
         <w:keepNext/>
         <w:spacing w:before="240"/>
       </w:pPr>
+      <w:bookmarkStart w:id="38" w:name="_Toc242716710"/>
       <w:r>
         <w:t>Addendum 1 Business Rule Clarifications</w:t>
       </w:r>
+      <w:bookmarkEnd w:id="38"/>
     </w:p>
     <w:p>
       <w:pPr>
@@ -9041,7 +9447,13 @@
         <w:ind w:left="360" w:hanging="360"/>
       </w:pPr>
       <w:r>
-        <w:t>BR-13: The initial implementation shall support market orders for positive whole-share quantities only. Short selling, margin trading, fractional shares, limit orders, and stop orders are outside the project scope.</w:t>
+        <w:t xml:space="preserve">BR-13: The initial implementation </w:t>
+      </w:r>
+      <w:r>
+        <w:t>will</w:t>
+      </w:r>
+      <w:r>
+        <w:t xml:space="preserve"> support market orders for positive whole-share quantities only. Short selling, margin trading, fractional shares, limit orders, and stop orders are outside the project scope.</w:t>
       </w:r>
     </w:p>
     <w:p>
@@ -9051,7 +9463,19 @@
         <w:ind w:left="360" w:hanging="360"/>
       </w:pPr>
       <w:r>
-        <w:t>BR-14: When the market is open, a valid order shall execute using the current simulated price. When the market is closed, the order shall remain pending until the application next evaluates it while the market is open.</w:t>
+        <w:t xml:space="preserve">BR-14: When the market is open, a valid order </w:t>
+      </w:r>
+      <w:r>
+        <w:t>will</w:t>
+      </w:r>
+      <w:r>
+        <w:t xml:space="preserve"> execute using the current simulated price. When the market is closed, the order </w:t>
+      </w:r>
+      <w:r>
+        <w:t>will</w:t>
+      </w:r>
+      <w:r>
+        <w:t xml:space="preserve"> remain pending until the application next evaluates it while the market is open.</w:t>
       </w:r>
     </w:p>
     <w:p>
@@ -9061,7 +9485,8 @@
         <w:ind w:left="360" w:hanging="360"/>
       </w:pPr>
       <w:r>
-        <w:t>BR-15: Customers may cancel their own pending orders. Cancelling an order shall release its reserved cash or shares. Executed orders cannot be cancelled.</w:t>
+        <w:lastRenderedPageBreak/>
+        <w:t>BR-15: The system will allow customers to cancel only their own pending orders and will release the cash or shares reserved for each successfully cancelled order. Executed orders cannot be cancelled.</w:t>
       </w:r>
     </w:p>
     <w:p>
@@ -9071,8 +9496,19 @@
         <w:ind w:left="360" w:hanging="360"/>
       </w:pPr>
       <w:r>
-        <w:lastRenderedPageBreak/>
-        <w:t>BR-16: Deposits and withdrawals shall use positive simulated-dollar amounts. A withdrawal shall not exceed the customer's available simulated cash.</w:t>
+        <w:t xml:space="preserve">BR-16: Deposits and withdrawals </w:t>
+      </w:r>
+      <w:r>
+        <w:t>will</w:t>
+      </w:r>
+      <w:r>
+        <w:t xml:space="preserve"> use positive simulated-dollar amounts. A withdrawal </w:t>
+      </w:r>
+      <w:r>
+        <w:t>will</w:t>
+      </w:r>
+      <w:r>
+        <w:t xml:space="preserve"> not exceed the customer's available simulated cash.</w:t>
       </w:r>
     </w:p>
     <w:p>
@@ -9082,7 +9518,19 @@
         <w:ind w:left="360" w:hanging="360"/>
       </w:pPr>
       <w:r>
-        <w:t>BR-17: The regular market schedule shall default to Monday through Friday, 9:30 a.m. through 4:00 p.m. in the America/New_York timezone. Administrator-created schedule exceptions shall override the regular schedule.</w:t>
+        <w:t xml:space="preserve">BR-17: The regular market schedule </w:t>
+      </w:r>
+      <w:r>
+        <w:t>will</w:t>
+      </w:r>
+      <w:r>
+        <w:t xml:space="preserve"> default to Monday through Friday, 9:30 a.m. through 4:00 p.m. in the America/New_York timezone. Administrator-created schedule exceptions </w:t>
+      </w:r>
+      <w:r>
+        <w:t>will</w:t>
+      </w:r>
+      <w:r>
+        <w:t xml:space="preserve"> override the regular schedule.</w:t>
       </w:r>
     </w:p>
     <w:p>
@@ -9090,9 +9538,11 @@
         <w:pStyle w:val="Heading2"/>
         <w:keepNext/>
       </w:pPr>
+      <w:bookmarkStart w:id="39" w:name="_Toc242716711"/>
       <w:r>
         <w:t>Implementation Notes</w:t>
       </w:r>
+      <w:bookmarkEnd w:id="39"/>
     </w:p>
     <w:p>
       <w:r>
@@ -9102,6 +9552,53 @@
     <w:p>
       <w:r>
         <w:t>The random-price generator will initially use a configurable maximum movement of 1 percent up or down per eligible update and will enforce a minimum stock price of $0.01. These values may be adjusted during testing and recorded in a future addendum entry if the change affects documented system behavior.</w:t>
+      </w:r>
+    </w:p>
+    <w:p>
+      <w:pPr>
+        <w:pStyle w:val="Heading2"/>
+      </w:pPr>
+      <w:r>
+        <w:t xml:space="preserve">Revision </w:t>
+      </w:r>
+      <w:r>
+        <w:t>Record October 12, 2026</w:t>
+      </w:r>
+    </w:p>
+    <w:p>
+      <w:pPr>
+        <w:ind w:firstLine="720"/>
+      </w:pPr>
+      <w:r>
+        <w:t>This revision addresses the September 19 instructor feedback. Requirements wording was changed from “shall” to “will,” ambiguous permission wording was clarified, and implementation-specific details were removed from selected requirements and business rules.</w:t>
+      </w:r>
+    </w:p>
+    <w:p>
+      <w:pPr>
+        <w:ind w:firstLine="720"/>
+      </w:pPr>
+      <w:r>
+        <w:t xml:space="preserve">Stock creation and display requirements were expanded to include share volume, market capitalization, opening price, and daily high and low prices. Stock-data definitions distinguish </w:t>
+      </w:r>
+      <w:r>
+        <w:lastRenderedPageBreak/>
+        <w:t>the administrator-entered initial price from the daily opening price and define market capitalization as share volume multiplied by current simulated price. Related process and wireframe descriptions and the Stock entity-purpose description were updated.</w:t>
+      </w:r>
+    </w:p>
+    <w:p>
+      <w:pPr>
+        <w:ind w:firstLine="720"/>
+      </w:pPr>
+      <w:r>
+        <w:t>These changes document required behavior and do not establish that all corresponding features have been implemented. The dedicated customer and administrator login process map, stock-management process image, stock wireframes, and Stock attributes in the ERD still require visual updates and verification. Schema, calculation, and display implementation remain subject to the related development tasks.</w:t>
+      </w:r>
+    </w:p>
+    <w:p>
+      <w:pPr>
+        <w:ind w:firstLine="720"/>
+      </w:pPr>
+      <w:r>
+        <w:t>The original submitted SAD is preserved unchanged.</w:t>
       </w:r>
     </w:p>
     <w:sectPr>

</xml_diff>